<commit_message>
Fold the Word-edited intro wording back into the review sheet generators
Someone reworded the instructions while reviewing the Word file. Those edits
would have been lost on the next regeneration, since the intro prose lives in
the generator rather than the Markdown, so they are ported into both writers
and the source sheet: drops 'without touching the website', 'Put anything that
doesn't fit', 'so we can fix it in the source data', and corrects 'colours'
to US spelling.

Co-Authored-By: Claude Opus 5 <noreply@anthropic.com>
</commit_message>
<xml_diff>
--- a/LongRange/docs/Housing Dashboard - Text Review.docx
+++ b/LongRange/docs/Housing Dashboard - Text Review.docx
@@ -41,7 +41,7 @@
           <w:sz w:val="22"/>
           <w:szCs w:val="22"/>
         </w:rPr>
-        <w:t xml:space="preserve">This is every piece of wording on the housing dashboard, in the order you meet it going down the page. Use it to rewrite any of the text without touching the website.</w:t>
+        <w:t xml:space="preserve">This is every piece of wording on the housing dashboard, in the order you meet it going down the page. Use it to rewrite any of the text.</w:t>
       </w:r>
     </w:p>
     <w:p>
@@ -119,7 +119,7 @@
           <w:sz w:val="22"/>
           <w:szCs w:val="22"/>
         </w:rPr>
-        <w:t xml:space="preserve">Anything that does not fit the tables goes in Other feedback at the end. Rough notes are fine, for example “T34 feels too passive” or “can the pipeline chart come first?”.</w:t>
+        <w:t xml:space="preserve">Put anything that doesn't fit the tables in Other feedback at the end. Rough notes are fine, for example “T34 feels too passive” or “can the pipeline chart come first?”.</w:t>
       </w:r>
     </w:p>
     <w:p>
@@ -146,7 +146,7 @@
           <w:sz w:val="22"/>
           <w:szCs w:val="22"/>
         </w:rPr>
-        <w:t xml:space="preserve">•	Every number. Unit counts, parcel counts, and years all come from the housing spreadsheet. If a number looks wrong, note it under Other feedback so it gets fixed in the source data.</w:t>
+        <w:t xml:space="preserve">•	Every number. Unit counts, parcel counts, and years all come from the housing spreadsheet. If a number looks wrong, note it under Other feedback so we can fix it in the source data.</w:t>
       </w:r>
     </w:p>
     <w:p>
@@ -172,7 +172,7 @@
           <w:sz w:val="22"/>
           <w:szCs w:val="22"/>
         </w:rPr>
-        <w:t xml:space="preserve">•	Chart colours, layout, and the order of sections. Ask for those under Other feedback.</w:t>
+        <w:t xml:space="preserve">•	Chart colors, layout, and the order of sections. Ask for those under Other feedback.</w:t>
       </w:r>
     </w:p>
     <w:p>

</xml_diff>

<commit_message>
Update the text review sheet for Karen's applied edits
132 entries now, adding the unverified-category hover note and the chart empty
state. Every quoted string re-verified against the live page. Karen's marked-up
copy is kept alongside as the record of the review.

Co-Authored-By: Claude Opus 5 <noreply@anthropic.com>
</commit_message>
<xml_diff>
--- a/LongRange/docs/Housing Dashboard - Text Review.docx
+++ b/LongRange/docs/Housing Dashboard - Text Review.docx
@@ -979,7 +979,7 @@
                 <w:sz w:val="21"/>
                 <w:szCs w:val="21"/>
               </w:rPr>
-              <w:t xml:space="preserve">How Tahoe's housing policies have added homes since the 2012 Regional Plan</w:t>
+              <w:t xml:space="preserve">Lake Tahoe Affordable and Workforce Housing Snapshot</w:t>
             </w:r>
           </w:p>
         </w:tc>
@@ -1044,7 +1044,7 @@
                 <w:sz w:val="21"/>
                 <w:szCs w:val="21"/>
               </w:rPr>
-              <w:t xml:space="preserve">Multifamily, deed-restricted, and accessory dwelling units built across the Basin's jurisdictions, plus the projects now in the pipeline.</w:t>
+              <w:t xml:space="preserve">Multifamily, deed-restricted, and accessory dwelling units built across the Tahoe Basin's jurisdictions, plus the projects now in the pipeline.</w:t>
             </w:r>
           </w:p>
         </w:tc>
@@ -1187,7 +1187,7 @@
                 <w:sz w:val="19"/>
                 <w:szCs w:val="19"/>
               </w:rPr>
-              <w:t xml:space="preserve">Only the labels can change here. The numbers are calculated from the spreadsheet. Each card also has a hover note, listed in section 4.</w:t>
+              <w:t xml:space="preserve">Only the labels can change here. The numbers are calculated from the spreadsheet. Each card also has a hover note, listed in section 4. The cards now run in the order Karen asked for on 16 Sept. 2026, so on the page you meet T13, T14, T15, then T12, then T16. The ID codes have not moved, so they still match earlier copies of this sheet.</w:t>
             </w:r>
           </w:p>
         </w:tc>
@@ -1994,7 +1994,7 @@
                 <w:sz w:val="21"/>
                 <w:szCs w:val="21"/>
               </w:rPr>
-              <w:t xml:space="preserve">Counts only the records TRPA tracks for affordable and workforce housing, not everything built in the Basin. Regionwide, 1,469 residential units were added since 2012, of which 409 are affordable or workforce. This figure also includes 293 subdivided condominium units, which are existing homes divided into separately owned units rather than new construction, and leaves out roughly 767 single-family homes.</w:t>
+              <w:t xml:space="preserve">Counts only the records TRPA tracks for affordable and workforce housing, not everything built in the Basin. Of this total, 409 units are affordable or workforce and 293 are unrestricted, most of them subdivided condominium units, which are existing homes divided into separately owned units rather than new construction. Regionwide, 1,469 residential units were added since 2012, so this figure also leaves out roughly 767 single-family homes.</w:t>
             </w:r>
           </w:p>
         </w:tc>
@@ -2124,7 +2124,7 @@
                 <w:sz w:val="21"/>
                 <w:szCs w:val="21"/>
               </w:rPr>
-              <w:t xml:space="preserve">Constructed deed-restricted units only. Permitted units that are not yet built, and units still in the pipeline, are not counted here.</w:t>
+              <w:t xml:space="preserve">Constructed deed-restricted units only. Permitted units that are not yet built, and units still in the pipeline, are not counted here. Includes deed-restricted accessory dwelling units.</w:t>
             </w:r>
           </w:p>
         </w:tc>
@@ -2189,7 +2189,7 @@
                 <w:sz w:val="21"/>
                 <w:szCs w:val="21"/>
               </w:rPr>
-              <w:t xml:space="preserve">Accessory dwelling units that have been built. Those approved but not yet constructed appear in the chart below.</w:t>
+              <w:t xml:space="preserve">Constructed accessory dwelling units. Those approved but not yet constructed appear in the chart below. Some accessory dwelling units are deed-restricted, some are unrestricted.</w:t>
             </w:r>
           </w:p>
         </w:tc>
@@ -2254,7 +2254,7 @@
                 <w:sz w:val="21"/>
                 <w:szCs w:val="21"/>
               </w:rPr>
-              <w:t xml:space="preserve">Affordable and workforce units only. Market-rate projects in the pipeline are not tracked here, and there are many more of them.</w:t>
+              <w:t xml:space="preserve">Affordable and workforce units only. Unrestricted single-family projects in the pipeline are not tracked here.</w:t>
             </w:r>
           </w:p>
         </w:tc>
@@ -2449,42 +2449,42 @@
                 <w:sz w:val="21"/>
                 <w:szCs w:val="21"/>
               </w:rPr>
-              <w:t xml:space="preserve">Market-rate multifamily in the pipeline is not tracked here. Market rate is not necessarily a worse outcome: many of these are multifamily units converted from commercial floor area or tourist accommodation units.</w:t>
-            </w:r>
-          </w:p>
-        </w:tc>
-        <w:tc>
-          <w:tcPr>
-            <w:tcW w:w="3580" w:type="dxa"/>
-            <w:shd w:val="clear" w:color="auto" w:fill="FFFDF0"/>
-          </w:tcPr>
-          <w:p>
-            <w:pPr>
-              <w:spacing w:before="0" w:after="0"/>
-            </w:pPr>
-          </w:p>
-        </w:tc>
-      </w:tr>
-      <w:tr>
-        <w:trPr>
-          <w:trHeight w:val="340" w:hRule="atLeast"/>
-        </w:trPr>
-        <w:tc>
-          <w:tcPr>
-            <w:tcW w:w="2200" w:type="dxa"/>
-          </w:tcPr>
-          <w:p>
-            <w:pPr>
-              <w:spacing w:before="0" w:after="0"/>
-            </w:pPr>
-            <w:r>
-              <w:rPr>
-                <w:b/>
-                <w:color w:val="075481"/>
-                <w:sz w:val="21"/>
-                <w:szCs w:val="21"/>
-              </w:rPr>
-              <w:t xml:space="preserve">T30</w:t>
+              <w:t xml:space="preserve">Unrestricted single-family housing, including condominiums, is not tracked here.</w:t>
+            </w:r>
+          </w:p>
+        </w:tc>
+        <w:tc>
+          <w:tcPr>
+            <w:tcW w:w="3580" w:type="dxa"/>
+            <w:shd w:val="clear" w:color="auto" w:fill="FFFDF0"/>
+          </w:tcPr>
+          <w:p>
+            <w:pPr>
+              <w:spacing w:before="0" w:after="0"/>
+            </w:pPr>
+          </w:p>
+        </w:tc>
+      </w:tr>
+      <w:tr>
+        <w:trPr>
+          <w:trHeight w:val="340" w:hRule="atLeast"/>
+        </w:trPr>
+        <w:tc>
+          <w:tcPr>
+            <w:tcW w:w="2200" w:type="dxa"/>
+          </w:tcPr>
+          <w:p>
+            <w:pPr>
+              <w:spacing w:before="0" w:after="0"/>
+            </w:pPr>
+            <w:r>
+              <w:rPr>
+                <w:b/>
+                <w:color w:val="075481"/>
+                <w:sz w:val="21"/>
+                <w:szCs w:val="21"/>
+              </w:rPr>
+              <w:t xml:space="preserve">T131</w:t>
             </w:r>
           </w:p>
           <w:p>
@@ -2497,6 +2497,71 @@
                 <w:sz w:val="17"/>
                 <w:szCs w:val="17"/>
               </w:rPr>
+              <w:t xml:space="preserve">On the map legend entry "Unverified or non-residential"</w:t>
+            </w:r>
+          </w:p>
+        </w:tc>
+        <w:tc>
+          <w:tcPr>
+            <w:tcW w:w="4300" w:type="dxa"/>
+          </w:tcPr>
+          <w:p>
+            <w:pPr>
+              <w:spacing w:before="0" w:after="0"/>
+            </w:pPr>
+            <w:r>
+              <w:rPr>
+                <w:sz w:val="21"/>
+                <w:szCs w:val="21"/>
+              </w:rPr>
+              <w:t xml:space="preserve">Constructed units that TRPA has not verified as affordable or workforce housing, or that are not residential at all, tourist accommodation units being the common case. They appear in the table but are counted in no total.</w:t>
+            </w:r>
+          </w:p>
+        </w:tc>
+        <w:tc>
+          <w:tcPr>
+            <w:tcW w:w="3580" w:type="dxa"/>
+            <w:shd w:val="clear" w:color="auto" w:fill="FFFDF0"/>
+          </w:tcPr>
+          <w:p>
+            <w:pPr>
+              <w:spacing w:before="0" w:after="0"/>
+            </w:pPr>
+          </w:p>
+        </w:tc>
+      </w:tr>
+      <w:tr>
+        <w:trPr>
+          <w:trHeight w:val="340" w:hRule="atLeast"/>
+        </w:trPr>
+        <w:tc>
+          <w:tcPr>
+            <w:tcW w:w="2200" w:type="dxa"/>
+          </w:tcPr>
+          <w:p>
+            <w:pPr>
+              <w:spacing w:before="0" w:after="0"/>
+            </w:pPr>
+            <w:r>
+              <w:rPr>
+                <w:b/>
+                <w:color w:val="075481"/>
+                <w:sz w:val="21"/>
+                <w:szCs w:val="21"/>
+              </w:rPr>
+              <w:t xml:space="preserve">T30</w:t>
+            </w:r>
+          </w:p>
+          <w:p>
+            <w:pPr>
+              <w:spacing w:before="0" w:after="0"/>
+            </w:pPr>
+            <w:r>
+              <w:rPr>
+                <w:color w:val="595959"/>
+                <w:sz w:val="17"/>
+                <w:szCs w:val="17"/>
+              </w:rPr>
               <w:t xml:space="preserve">On the "Existing units by year built" chart</w:t>
             </w:r>
           </w:p>
@@ -2514,7 +2579,7 @@
                 <w:sz w:val="21"/>
                 <w:szCs w:val="21"/>
               </w:rPr>
-              <w:t xml:space="preserve">Covers only units tracked in the affordable and workforce inventory. Single-family homes built as single-family are not included.</w:t>
+              <w:t xml:space="preserve">Units built since 2012, split into deed-restricted units and everything else tracked in the affordable and workforce inventory, which includes unrestricted multifamily and unrestricted accessory dwelling units. Single-family homes built as single-family are not included.</w:t>
             </w:r>
           </w:p>
         </w:tc>
@@ -3525,7 +3590,7 @@
                 <w:sz w:val="21"/>
                 <w:szCs w:val="21"/>
               </w:rPr>
-              <w:t xml:space="preserve">Each jurisdiction is adding homes in its own way</w:t>
+              <w:t xml:space="preserve">Each jurisdiction addresses housing in its own way</w:t>
             </w:r>
           </w:p>
         </w:tc>
@@ -4468,7 +4533,7 @@
                 <w:sz w:val="21"/>
                 <w:szCs w:val="21"/>
               </w:rPr>
-              <w:t xml:space="preserve">Market rate</w:t>
+              <w:t xml:space="preserve">Unrestricted</w:t>
             </w:r>
           </w:p>
         </w:tc>
@@ -4647,7 +4712,7 @@
                 <w:sz w:val="21"/>
                 <w:szCs w:val="21"/>
               </w:rPr>
-              <w:t xml:space="preserve">Market rate</w:t>
+              <w:t xml:space="preserve">Unrestricted</w:t>
             </w:r>
           </w:p>
         </w:tc>
@@ -4856,6 +4921,71 @@
                 <w:szCs w:val="21"/>
               </w:rPr>
               <w:t xml:space="preserve">Parcel boundaries, once zoomed in</w:t>
+            </w:r>
+          </w:p>
+        </w:tc>
+        <w:tc>
+          <w:tcPr>
+            <w:tcW w:w="3580" w:type="dxa"/>
+            <w:shd w:val="clear" w:color="auto" w:fill="FFFDF0"/>
+          </w:tcPr>
+          <w:p>
+            <w:pPr>
+              <w:spacing w:before="0" w:after="0"/>
+            </w:pPr>
+          </w:p>
+        </w:tc>
+      </w:tr>
+      <w:tr>
+        <w:trPr>
+          <w:trHeight w:val="340" w:hRule="atLeast"/>
+        </w:trPr>
+        <w:tc>
+          <w:tcPr>
+            <w:tcW w:w="2200" w:type="dxa"/>
+          </w:tcPr>
+          <w:p>
+            <w:pPr>
+              <w:spacing w:before="0" w:after="0"/>
+            </w:pPr>
+            <w:r>
+              <w:rPr>
+                <w:b/>
+                <w:color w:val="075481"/>
+                <w:sz w:val="21"/>
+                <w:szCs w:val="21"/>
+              </w:rPr>
+              <w:t xml:space="preserve">T132</w:t>
+            </w:r>
+          </w:p>
+          <w:p>
+            <w:pPr>
+              <w:spacing w:before="0" w:after="0"/>
+            </w:pPr>
+            <w:r>
+              <w:rPr>
+                <w:color w:val="595959"/>
+                <w:sz w:val="17"/>
+                <w:szCs w:val="17"/>
+              </w:rPr>
+              <w:t xml:space="preserve">Shown on a chart when the filters leave it with nothing to draw</w:t>
+            </w:r>
+          </w:p>
+        </w:tc>
+        <w:tc>
+          <w:tcPr>
+            <w:tcW w:w="4300" w:type="dxa"/>
+          </w:tcPr>
+          <w:p>
+            <w:pPr>
+              <w:spacing w:before="0" w:after="0"/>
+            </w:pPr>
+            <w:r>
+              <w:rPr>
+                <w:sz w:val="21"/>
+                <w:szCs w:val="21"/>
+              </w:rPr>
+              <w:t xml:space="preserve">No units match the current filters</w:t>
             </w:r>
           </w:p>
         </w:tc>
@@ -5502,7 +5632,7 @@
                 <w:sz w:val="19"/>
                 <w:szCs w:val="19"/>
               </w:rPr>
-              <w:t xml:space="preserve">Please confirm 2023 is the right year for the Phase 2 Housing Amendments.</w:t>
+              <w:t xml:space="preserve">Confirmed by Karen Fink, 16 Sept. 2026: the Phase 2 Housing Amendments were approved in December 2023.</w:t>
             </w:r>
           </w:p>
         </w:tc>

</xml_diff>

<commit_message>
Apply Karen's October review and refresh the text sheet against the live page
Her two items: drop 'Since 2012' from the page title, the header, and the
landing page card, since the lead charts show existing stock much of which
predates 2012.

The sheet had gone stale. Three commits on 23 Sept. removed the data table
section and the non-restricted multifamily chart, split the timeline three
ways, added the 2021 Phase 1 milestone and its per-milestone notes, and
reworked the map legend. 32 entries for features that no longer exist are
removed and the changed wording is updated; surviving IDs keep their numbers
so earlier copies still line up. 108 entries, all re-verified against the page.

Co-Authored-By: Claude Opus 5 <noreply@anthropic.com>
</commit_message>
<xml_diff>
--- a/LongRange/docs/Housing Dashboard - Text Review.docx
+++ b/LongRange/docs/Housing Dashboard - Text Review.docx
@@ -327,7 +327,7 @@
                 <w:sz w:val="21"/>
                 <w:szCs w:val="21"/>
               </w:rPr>
-              <w:t xml:space="preserve">Housing Progress Since 2012 — Tahoe Living</w:t>
+              <w:t xml:space="preserve">Housing Progress — Tahoe Living</w:t>
             </w:r>
           </w:p>
         </w:tc>
@@ -457,7 +457,7 @@
                 <w:sz w:val="21"/>
                 <w:szCs w:val="21"/>
               </w:rPr>
-              <w:t xml:space="preserve">Housing Progress Since 2012</w:t>
+              <w:t xml:space="preserve">Housing Progress</w:t>
             </w:r>
           </w:p>
         </w:tc>
@@ -637,58 +637,6 @@
                 <w:szCs w:val="21"/>
               </w:rPr>
               <w:t xml:space="preserve">Featured projects</w:t>
-            </w:r>
-          </w:p>
-        </w:tc>
-        <w:tc>
-          <w:tcPr>
-            <w:tcW w:w="3580" w:type="dxa"/>
-            <w:shd w:val="clear" w:color="auto" w:fill="FFFDF0"/>
-          </w:tcPr>
-          <w:p>
-            <w:pPr>
-              <w:spacing w:before="0" w:after="0"/>
-            </w:pPr>
-          </w:p>
-        </w:tc>
-      </w:tr>
-      <w:tr>
-        <w:trPr>
-          <w:trHeight w:val="340" w:hRule="atLeast"/>
-        </w:trPr>
-        <w:tc>
-          <w:tcPr>
-            <w:tcW w:w="2200" w:type="dxa"/>
-          </w:tcPr>
-          <w:p>
-            <w:pPr>
-              <w:spacing w:before="0" w:after="0"/>
-            </w:pPr>
-            <w:r>
-              <w:rPr>
-                <w:b/>
-                <w:color w:val="075481"/>
-                <w:sz w:val="21"/>
-                <w:szCs w:val="21"/>
-              </w:rPr>
-              <w:t xml:space="preserve">T07</w:t>
-            </w:r>
-          </w:p>
-        </w:tc>
-        <w:tc>
-          <w:tcPr>
-            <w:tcW w:w="4300" w:type="dxa"/>
-          </w:tcPr>
-          <w:p>
-            <w:pPr>
-              <w:spacing w:before="0" w:after="0"/>
-            </w:pPr>
-            <w:r>
-              <w:rPr>
-                <w:sz w:val="21"/>
-                <w:szCs w:val="21"/>
-              </w:rPr>
-              <w:t xml:space="preserve">Data</w:t>
             </w:r>
           </w:p>
         </w:tc>
@@ -1241,7 +1189,7 @@
                 <w:sz w:val="21"/>
                 <w:szCs w:val="21"/>
               </w:rPr>
-              <w:t xml:space="preserve">Multifamily units built since 2012</w:t>
+              <w:t xml:space="preserve">Affordable &amp; workforce units built since 2012</w:t>
             </w:r>
           </w:p>
         </w:tc>
@@ -1537,7 +1485,7 @@
                 <w:sz w:val="21"/>
                 <w:szCs w:val="21"/>
               </w:rPr>
-              <w:t xml:space="preserve">parcels · of 1,469 added regionwide</w:t>
+              <w:t xml:space="preserve">parcels</w:t>
             </w:r>
           </w:p>
         </w:tc>
@@ -1994,7 +1942,7 @@
                 <w:sz w:val="21"/>
                 <w:szCs w:val="21"/>
               </w:rPr>
-              <w:t xml:space="preserve">Counts only the records TRPA tracks for affordable and workforce housing, not everything built in the Basin. Of this total, 409 units are affordable or workforce and 293 are unrestricted, most of them subdivided condominium units, which are existing homes divided into separately owned units rather than new construction. Regionwide, 1,469 residential units were added since 2012, so this figure also leaves out roughly 767 single-family homes.</w:t>
+              <w:t xml:space="preserve">Counts only the records TRPA tracks for affordable and workforce housing, not everything built in the Basin. Since 2012, N affordable and workforce units have been constructed. Regionwide, 1,469 residential units were added since 2012, see data.trpa.gov/regional-plan-tracking for more details.</w:t>
             </w:r>
           </w:p>
         </w:tc>
@@ -2354,7 +2302,7 @@
                 <w:sz w:val="21"/>
                 <w:szCs w:val="21"/>
               </w:rPr>
-              <w:t xml:space="preserve">T28</w:t>
+              <w:t xml:space="preserve">T29</w:t>
             </w:r>
           </w:p>
           <w:p>
@@ -2367,59 +2315,59 @@
                 <w:sz w:val="17"/>
                 <w:szCs w:val="17"/>
               </w:rPr>
-              <w:t xml:space="preserve">On the "Non-restricted multifamily units built since 2012" chart</w:t>
-            </w:r>
-          </w:p>
-        </w:tc>
-        <w:tc>
-          <w:tcPr>
-            <w:tcW w:w="4300" w:type="dxa"/>
-          </w:tcPr>
-          <w:p>
-            <w:pPr>
-              <w:spacing w:before="0" w:after="0"/>
-            </w:pPr>
-            <w:r>
-              <w:rPr>
-                <w:sz w:val="21"/>
-                <w:szCs w:val="21"/>
-              </w:rPr>
-              <w:t xml:space="preserve">Incomplete. This covers units proposed or built as multifamily and later subdivided. Single-family homes that were built as single-family are not included.</w:t>
-            </w:r>
-          </w:p>
-        </w:tc>
-        <w:tc>
-          <w:tcPr>
-            <w:tcW w:w="3580" w:type="dxa"/>
-            <w:shd w:val="clear" w:color="auto" w:fill="FFFDF0"/>
-          </w:tcPr>
-          <w:p>
-            <w:pPr>
-              <w:spacing w:before="0" w:after="0"/>
-            </w:pPr>
-          </w:p>
-        </w:tc>
-      </w:tr>
-      <w:tr>
-        <w:trPr>
-          <w:trHeight w:val="340" w:hRule="atLeast"/>
-        </w:trPr>
-        <w:tc>
-          <w:tcPr>
-            <w:tcW w:w="2200" w:type="dxa"/>
-          </w:tcPr>
-          <w:p>
-            <w:pPr>
-              <w:spacing w:before="0" w:after="0"/>
-            </w:pPr>
-            <w:r>
-              <w:rPr>
-                <w:b/>
-                <w:color w:val="075481"/>
-                <w:sz w:val="21"/>
-                <w:szCs w:val="21"/>
-              </w:rPr>
-              <w:t xml:space="preserve">T29</w:t>
+              <w:t xml:space="preserve">On the "Units in the pipeline" chart</w:t>
+            </w:r>
+          </w:p>
+        </w:tc>
+        <w:tc>
+          <w:tcPr>
+            <w:tcW w:w="4300" w:type="dxa"/>
+          </w:tcPr>
+          <w:p>
+            <w:pPr>
+              <w:spacing w:before="0" w:after="0"/>
+            </w:pPr>
+            <w:r>
+              <w:rPr>
+                <w:sz w:val="21"/>
+                <w:szCs w:val="21"/>
+              </w:rPr>
+              <w:t xml:space="preserve">Unrestricted single-family housing, including condominiums, is not tracked here.</w:t>
+            </w:r>
+          </w:p>
+        </w:tc>
+        <w:tc>
+          <w:tcPr>
+            <w:tcW w:w="3580" w:type="dxa"/>
+            <w:shd w:val="clear" w:color="auto" w:fill="FFFDF0"/>
+          </w:tcPr>
+          <w:p>
+            <w:pPr>
+              <w:spacing w:before="0" w:after="0"/>
+            </w:pPr>
+          </w:p>
+        </w:tc>
+      </w:tr>
+      <w:tr>
+        <w:trPr>
+          <w:trHeight w:val="340" w:hRule="atLeast"/>
+        </w:trPr>
+        <w:tc>
+          <w:tcPr>
+            <w:tcW w:w="2200" w:type="dxa"/>
+          </w:tcPr>
+          <w:p>
+            <w:pPr>
+              <w:spacing w:before="0" w:after="0"/>
+            </w:pPr>
+            <w:r>
+              <w:rPr>
+                <w:b/>
+                <w:color w:val="075481"/>
+                <w:sz w:val="21"/>
+                <w:szCs w:val="21"/>
+              </w:rPr>
+              <w:t xml:space="preserve">T30</w:t>
             </w:r>
           </w:p>
           <w:p>
@@ -2432,136 +2380,6 @@
                 <w:sz w:val="17"/>
                 <w:szCs w:val="17"/>
               </w:rPr>
-              <w:t xml:space="preserve">On the "Units in the pipeline" chart</w:t>
-            </w:r>
-          </w:p>
-        </w:tc>
-        <w:tc>
-          <w:tcPr>
-            <w:tcW w:w="4300" w:type="dxa"/>
-          </w:tcPr>
-          <w:p>
-            <w:pPr>
-              <w:spacing w:before="0" w:after="0"/>
-            </w:pPr>
-            <w:r>
-              <w:rPr>
-                <w:sz w:val="21"/>
-                <w:szCs w:val="21"/>
-              </w:rPr>
-              <w:t xml:space="preserve">Unrestricted single-family housing, including condominiums, is not tracked here.</w:t>
-            </w:r>
-          </w:p>
-        </w:tc>
-        <w:tc>
-          <w:tcPr>
-            <w:tcW w:w="3580" w:type="dxa"/>
-            <w:shd w:val="clear" w:color="auto" w:fill="FFFDF0"/>
-          </w:tcPr>
-          <w:p>
-            <w:pPr>
-              <w:spacing w:before="0" w:after="0"/>
-            </w:pPr>
-          </w:p>
-        </w:tc>
-      </w:tr>
-      <w:tr>
-        <w:trPr>
-          <w:trHeight w:val="340" w:hRule="atLeast"/>
-        </w:trPr>
-        <w:tc>
-          <w:tcPr>
-            <w:tcW w:w="2200" w:type="dxa"/>
-          </w:tcPr>
-          <w:p>
-            <w:pPr>
-              <w:spacing w:before="0" w:after="0"/>
-            </w:pPr>
-            <w:r>
-              <w:rPr>
-                <w:b/>
-                <w:color w:val="075481"/>
-                <w:sz w:val="21"/>
-                <w:szCs w:val="21"/>
-              </w:rPr>
-              <w:t xml:space="preserve">T131</w:t>
-            </w:r>
-          </w:p>
-          <w:p>
-            <w:pPr>
-              <w:spacing w:before="0" w:after="0"/>
-            </w:pPr>
-            <w:r>
-              <w:rPr>
-                <w:color w:val="595959"/>
-                <w:sz w:val="17"/>
-                <w:szCs w:val="17"/>
-              </w:rPr>
-              <w:t xml:space="preserve">On the map legend entry "Unverified or non-residential"</w:t>
-            </w:r>
-          </w:p>
-        </w:tc>
-        <w:tc>
-          <w:tcPr>
-            <w:tcW w:w="4300" w:type="dxa"/>
-          </w:tcPr>
-          <w:p>
-            <w:pPr>
-              <w:spacing w:before="0" w:after="0"/>
-            </w:pPr>
-            <w:r>
-              <w:rPr>
-                <w:sz w:val="21"/>
-                <w:szCs w:val="21"/>
-              </w:rPr>
-              <w:t xml:space="preserve">Constructed units that TRPA has not verified as affordable or workforce housing, or that are not residential at all, tourist accommodation units being the common case. They appear in the table but are counted in no total.</w:t>
-            </w:r>
-          </w:p>
-        </w:tc>
-        <w:tc>
-          <w:tcPr>
-            <w:tcW w:w="3580" w:type="dxa"/>
-            <w:shd w:val="clear" w:color="auto" w:fill="FFFDF0"/>
-          </w:tcPr>
-          <w:p>
-            <w:pPr>
-              <w:spacing w:before="0" w:after="0"/>
-            </w:pPr>
-          </w:p>
-        </w:tc>
-      </w:tr>
-      <w:tr>
-        <w:trPr>
-          <w:trHeight w:val="340" w:hRule="atLeast"/>
-        </w:trPr>
-        <w:tc>
-          <w:tcPr>
-            <w:tcW w:w="2200" w:type="dxa"/>
-          </w:tcPr>
-          <w:p>
-            <w:pPr>
-              <w:spacing w:before="0" w:after="0"/>
-            </w:pPr>
-            <w:r>
-              <w:rPr>
-                <w:b/>
-                <w:color w:val="075481"/>
-                <w:sz w:val="21"/>
-                <w:szCs w:val="21"/>
-              </w:rPr>
-              <w:t xml:space="preserve">T30</w:t>
-            </w:r>
-          </w:p>
-          <w:p>
-            <w:pPr>
-              <w:spacing w:before="0" w:after="0"/>
-            </w:pPr>
-            <w:r>
-              <w:rPr>
-                <w:color w:val="595959"/>
-                <w:sz w:val="17"/>
-                <w:szCs w:val="17"/>
-              </w:rPr>
               <w:t xml:space="preserve">On the "Existing units by year built" chart</w:t>
             </w:r>
           </w:p>
@@ -2579,7 +2397,7 @@
                 <w:sz w:val="21"/>
                 <w:szCs w:val="21"/>
               </w:rPr>
-              <w:t xml:space="preserve">Units built since 2012, split into deed-restricted units and everything else tracked in the affordable and workforce inventory, which includes unrestricted multifamily and unrestricted accessory dwelling units. Single-family homes built as single-family are not included.</w:t>
+              <w:t xml:space="preserve">Units built since 2012, split into deed-restricted units, accessory dwelling units, and other affordable and workforce inventory. Single-family homes and subdivided units are not included.</w:t>
             </w:r>
           </w:p>
         </w:tc>
@@ -3655,7 +3473,7 @@
                 <w:sz w:val="21"/>
                 <w:szCs w:val="21"/>
               </w:rPr>
-              <w:t xml:space="preserve">Click a parcel on the map or a row in the table to zoom to it and open its housing records. To change what the charts, map, and table show, use the filters above.</w:t>
+              <w:t xml:space="preserve">The map groups existing affordable and workforce units by area, with bigger circles for more units. Click a circle to see how many units and parcels it covers. To change what the charts and map show, including units in the pipeline, use the filters above.</w:t>
             </w:r>
           </w:p>
         </w:tc>
@@ -3689,7 +3507,7 @@
                 <w:sz w:val="19"/>
                 <w:szCs w:val="19"/>
               </w:rPr>
-              <w:t xml:space="preserve">The four charts, in the order they appear:</w:t>
+              <w:t xml:space="preserve">The three charts, in the order they appear:</w:t>
             </w:r>
           </w:p>
         </w:tc>
@@ -4069,136 +3887,6 @@
                 <w:szCs w:val="21"/>
               </w:rPr>
               <w:t xml:space="preserve">Permitted but not yet constructed, plus bonus units reserved for projects not yet submitted</w:t>
-            </w:r>
-          </w:p>
-        </w:tc>
-        <w:tc>
-          <w:tcPr>
-            <w:tcW w:w="3580" w:type="dxa"/>
-            <w:shd w:val="clear" w:color="auto" w:fill="FFFDF0"/>
-          </w:tcPr>
-          <w:p>
-            <w:pPr>
-              <w:spacing w:before="0" w:after="0"/>
-            </w:pPr>
-          </w:p>
-        </w:tc>
-      </w:tr>
-      <w:tr>
-        <w:trPr>
-          <w:trHeight w:val="340" w:hRule="atLeast"/>
-        </w:trPr>
-        <w:tc>
-          <w:tcPr>
-            <w:tcW w:w="2200" w:type="dxa"/>
-          </w:tcPr>
-          <w:p>
-            <w:pPr>
-              <w:spacing w:before="0" w:after="0"/>
-            </w:pPr>
-            <w:r>
-              <w:rPr>
-                <w:b/>
-                <w:color w:val="075481"/>
-                <w:sz w:val="21"/>
-                <w:szCs w:val="21"/>
-              </w:rPr>
-              <w:t xml:space="preserve">T51</w:t>
-            </w:r>
-          </w:p>
-          <w:p>
-            <w:pPr>
-              <w:spacing w:before="0" w:after="0"/>
-            </w:pPr>
-            <w:r>
-              <w:rPr>
-                <w:color w:val="595959"/>
-                <w:sz w:val="17"/>
-                <w:szCs w:val="17"/>
-              </w:rPr>
-              <w:t xml:space="preserve">Chart 4 title</w:t>
-            </w:r>
-          </w:p>
-        </w:tc>
-        <w:tc>
-          <w:tcPr>
-            <w:tcW w:w="4300" w:type="dxa"/>
-          </w:tcPr>
-          <w:p>
-            <w:pPr>
-              <w:spacing w:before="0" w:after="0"/>
-            </w:pPr>
-            <w:r>
-              <w:rPr>
-                <w:sz w:val="21"/>
-                <w:szCs w:val="21"/>
-              </w:rPr>
-              <w:t xml:space="preserve">Non-restricted multifamily units built since 2012</w:t>
-            </w:r>
-          </w:p>
-        </w:tc>
-        <w:tc>
-          <w:tcPr>
-            <w:tcW w:w="3580" w:type="dxa"/>
-            <w:shd w:val="clear" w:color="auto" w:fill="FFFDF0"/>
-          </w:tcPr>
-          <w:p>
-            <w:pPr>
-              <w:spacing w:before="0" w:after="0"/>
-            </w:pPr>
-          </w:p>
-        </w:tc>
-      </w:tr>
-      <w:tr>
-        <w:trPr>
-          <w:trHeight w:val="340" w:hRule="atLeast"/>
-        </w:trPr>
-        <w:tc>
-          <w:tcPr>
-            <w:tcW w:w="2200" w:type="dxa"/>
-          </w:tcPr>
-          <w:p>
-            <w:pPr>
-              <w:spacing w:before="0" w:after="0"/>
-            </w:pPr>
-            <w:r>
-              <w:rPr>
-                <w:b/>
-                <w:color w:val="075481"/>
-                <w:sz w:val="21"/>
-                <w:szCs w:val="21"/>
-              </w:rPr>
-              <w:t xml:space="preserve">T52</w:t>
-            </w:r>
-          </w:p>
-          <w:p>
-            <w:pPr>
-              <w:spacing w:before="0" w:after="0"/>
-            </w:pPr>
-            <w:r>
-              <w:rPr>
-                <w:color w:val="595959"/>
-                <w:sz w:val="17"/>
-                <w:szCs w:val="17"/>
-              </w:rPr>
-              <w:t xml:space="preserve">Chart 4 caption</w:t>
-            </w:r>
-          </w:p>
-        </w:tc>
-        <w:tc>
-          <w:tcPr>
-            <w:tcW w:w="4300" w:type="dxa"/>
-          </w:tcPr>
-          <w:p>
-            <w:pPr>
-              <w:spacing w:before="0" w:after="0"/>
-            </w:pPr>
-            <w:r>
-              <w:rPr>
-                <w:sz w:val="21"/>
-                <w:szCs w:val="21"/>
-              </w:rPr>
-              <w:t xml:space="preserve">Existing units, built 2012 or later, not flagged affordable or workforce</w:t>
             </w:r>
           </w:p>
         </w:tc>
@@ -4550,58 +4238,6 @@
         </w:tc>
       </w:tr>
       <w:tr>
-        <w:trPr>
-          <w:trHeight w:val="340" w:hRule="atLeast"/>
-        </w:trPr>
-        <w:tc>
-          <w:tcPr>
-            <w:tcW w:w="2200" w:type="dxa"/>
-          </w:tcPr>
-          <w:p>
-            <w:pPr>
-              <w:spacing w:before="0" w:after="0"/>
-            </w:pPr>
-            <w:r>
-              <w:rPr>
-                <w:b/>
-                <w:color w:val="075481"/>
-                <w:sz w:val="21"/>
-                <w:szCs w:val="21"/>
-              </w:rPr>
-              <w:t xml:space="preserve">T59</w:t>
-            </w:r>
-          </w:p>
-        </w:tc>
-        <w:tc>
-          <w:tcPr>
-            <w:tcW w:w="4300" w:type="dxa"/>
-          </w:tcPr>
-          <w:p>
-            <w:pPr>
-              <w:spacing w:before="0" w:after="0"/>
-            </w:pPr>
-            <w:r>
-              <w:rPr>
-                <w:sz w:val="21"/>
-                <w:szCs w:val="21"/>
-              </w:rPr>
-              <w:t xml:space="preserve">Non-restricted multifamily</w:t>
-            </w:r>
-          </w:p>
-        </w:tc>
-        <w:tc>
-          <w:tcPr>
-            <w:tcW w:w="3580" w:type="dxa"/>
-            <w:shd w:val="clear" w:color="auto" w:fill="FFFDF0"/>
-          </w:tcPr>
-          <w:p>
-            <w:pPr>
-              <w:spacing w:before="0" w:after="0"/>
-            </w:pPr>
-          </w:p>
-        </w:tc>
-      </w:tr>
-      <w:tr>
         <w:tc>
           <w:tcPr>
             <w:tcW w:w="10080" w:type="dxa"/>
@@ -4660,163 +4296,7 @@
                 <w:sz w:val="21"/>
                 <w:szCs w:val="21"/>
               </w:rPr>
-              <w:t xml:space="preserve">Affordable &amp; workforce</w:t>
-            </w:r>
-          </w:p>
-        </w:tc>
-        <w:tc>
-          <w:tcPr>
-            <w:tcW w:w="3580" w:type="dxa"/>
-            <w:shd w:val="clear" w:color="auto" w:fill="FFFDF0"/>
-          </w:tcPr>
-          <w:p>
-            <w:pPr>
-              <w:spacing w:before="0" w:after="0"/>
-            </w:pPr>
-          </w:p>
-        </w:tc>
-      </w:tr>
-      <w:tr>
-        <w:trPr>
-          <w:trHeight w:val="340" w:hRule="atLeast"/>
-        </w:trPr>
-        <w:tc>
-          <w:tcPr>
-            <w:tcW w:w="2200" w:type="dxa"/>
-          </w:tcPr>
-          <w:p>
-            <w:pPr>
-              <w:spacing w:before="0" w:after="0"/>
-            </w:pPr>
-            <w:r>
-              <w:rPr>
-                <w:b/>
-                <w:color w:val="075481"/>
-                <w:sz w:val="21"/>
-                <w:szCs w:val="21"/>
-              </w:rPr>
-              <w:t xml:space="preserve">T61</w:t>
-            </w:r>
-          </w:p>
-        </w:tc>
-        <w:tc>
-          <w:tcPr>
-            <w:tcW w:w="4300" w:type="dxa"/>
-          </w:tcPr>
-          <w:p>
-            <w:pPr>
-              <w:spacing w:before="0" w:after="0"/>
-            </w:pPr>
-            <w:r>
-              <w:rPr>
-                <w:sz w:val="21"/>
-                <w:szCs w:val="21"/>
-              </w:rPr>
-              <w:t xml:space="preserve">Unrestricted</w:t>
-            </w:r>
-          </w:p>
-        </w:tc>
-        <w:tc>
-          <w:tcPr>
-            <w:tcW w:w="3580" w:type="dxa"/>
-            <w:shd w:val="clear" w:color="auto" w:fill="FFFDF0"/>
-          </w:tcPr>
-          <w:p>
-            <w:pPr>
-              <w:spacing w:before="0" w:after="0"/>
-            </w:pPr>
-          </w:p>
-        </w:tc>
-      </w:tr>
-      <w:tr>
-        <w:trPr>
-          <w:trHeight w:val="340" w:hRule="atLeast"/>
-        </w:trPr>
-        <w:tc>
-          <w:tcPr>
-            <w:tcW w:w="2200" w:type="dxa"/>
-          </w:tcPr>
-          <w:p>
-            <w:pPr>
-              <w:spacing w:before="0" w:after="0"/>
-            </w:pPr>
-            <w:r>
-              <w:rPr>
-                <w:b/>
-                <w:color w:val="075481"/>
-                <w:sz w:val="21"/>
-                <w:szCs w:val="21"/>
-              </w:rPr>
-              <w:t xml:space="preserve">T62</w:t>
-            </w:r>
-          </w:p>
-        </w:tc>
-        <w:tc>
-          <w:tcPr>
-            <w:tcW w:w="4300" w:type="dxa"/>
-          </w:tcPr>
-          <w:p>
-            <w:pPr>
-              <w:spacing w:before="0" w:after="0"/>
-            </w:pPr>
-            <w:r>
-              <w:rPr>
-                <w:sz w:val="21"/>
-                <w:szCs w:val="21"/>
-              </w:rPr>
-              <w:t xml:space="preserve">Pipeline only</w:t>
-            </w:r>
-          </w:p>
-        </w:tc>
-        <w:tc>
-          <w:tcPr>
-            <w:tcW w:w="3580" w:type="dxa"/>
-            <w:shd w:val="clear" w:color="auto" w:fill="FFFDF0"/>
-          </w:tcPr>
-          <w:p>
-            <w:pPr>
-              <w:spacing w:before="0" w:after="0"/>
-            </w:pPr>
-          </w:p>
-        </w:tc>
-      </w:tr>
-      <w:tr>
-        <w:trPr>
-          <w:trHeight w:val="340" w:hRule="atLeast"/>
-        </w:trPr>
-        <w:tc>
-          <w:tcPr>
-            <w:tcW w:w="2200" w:type="dxa"/>
-          </w:tcPr>
-          <w:p>
-            <w:pPr>
-              <w:spacing w:before="0" w:after="0"/>
-            </w:pPr>
-            <w:r>
-              <w:rPr>
-                <w:b/>
-                <w:color w:val="075481"/>
-                <w:sz w:val="21"/>
-                <w:szCs w:val="21"/>
-              </w:rPr>
-              <w:t xml:space="preserve">T63</w:t>
-            </w:r>
-          </w:p>
-        </w:tc>
-        <w:tc>
-          <w:tcPr>
-            <w:tcW w:w="4300" w:type="dxa"/>
-          </w:tcPr>
-          <w:p>
-            <w:pPr>
-              <w:spacing w:before="0" w:after="0"/>
-            </w:pPr>
-            <w:r>
-              <w:rPr>
-                <w:sz w:val="21"/>
-                <w:szCs w:val="21"/>
-              </w:rPr>
-              <w:t xml:space="preserve">Unverified or non-residential</w:t>
+              <w:t xml:space="preserve">Existing affordable &amp; workforce units. Circle size and label show the total.</w:t>
             </w:r>
           </w:p>
         </w:tc>
@@ -4869,58 +4349,6 @@
                 <w:szCs w:val="21"/>
               </w:rPr>
               <w:t xml:space="preserve">TRPA boundary</w:t>
-            </w:r>
-          </w:p>
-        </w:tc>
-        <w:tc>
-          <w:tcPr>
-            <w:tcW w:w="3580" w:type="dxa"/>
-            <w:shd w:val="clear" w:color="auto" w:fill="FFFDF0"/>
-          </w:tcPr>
-          <w:p>
-            <w:pPr>
-              <w:spacing w:before="0" w:after="0"/>
-            </w:pPr>
-          </w:p>
-        </w:tc>
-      </w:tr>
-      <w:tr>
-        <w:trPr>
-          <w:trHeight w:val="340" w:hRule="atLeast"/>
-        </w:trPr>
-        <w:tc>
-          <w:tcPr>
-            <w:tcW w:w="2200" w:type="dxa"/>
-          </w:tcPr>
-          <w:p>
-            <w:pPr>
-              <w:spacing w:before="0" w:after="0"/>
-            </w:pPr>
-            <w:r>
-              <w:rPr>
-                <w:b/>
-                <w:color w:val="075481"/>
-                <w:sz w:val="21"/>
-                <w:szCs w:val="21"/>
-              </w:rPr>
-              <w:t xml:space="preserve">T65</w:t>
-            </w:r>
-          </w:p>
-        </w:tc>
-        <w:tc>
-          <w:tcPr>
-            <w:tcW w:w="4300" w:type="dxa"/>
-          </w:tcPr>
-          <w:p>
-            <w:pPr>
-              <w:spacing w:before="0" w:after="0"/>
-            </w:pPr>
-            <w:r>
-              <w:rPr>
-                <w:sz w:val="21"/>
-                <w:szCs w:val="21"/>
-              </w:rPr>
-              <w:t xml:space="preserve">Parcel boundaries, once zoomed in</w:t>
             </w:r>
           </w:p>
         </w:tc>
@@ -5050,7 +4478,7 @@
                 <w:sz w:val="21"/>
                 <w:szCs w:val="21"/>
               </w:rPr>
-              <w:t xml:space="preserve">Cluster labels show total units. Zoom in to see individual parcels.</w:t>
+              <w:t xml:space="preserve">Select a Timing filter to map units in the pipeline. The map stays at neighborhood scale, so individual parcels are not shown.</w:t>
             </w:r>
           </w:p>
         </w:tc>
@@ -5419,7 +4847,7 @@
                 <w:sz w:val="21"/>
                 <w:szCs w:val="21"/>
               </w:rPr>
-              <w:t xml:space="preserve">Existing units built 2012 or later. Policy milestones marked.</w:t>
+              <w:t xml:space="preserve">Affordable and workforce units built 2012 or later, with accessory dwelling units shown on their own. Policy milestones marked.</w:t>
             </w:r>
           </w:p>
         </w:tc>
@@ -5599,6 +5027,520 @@
                 <w:szCs w:val="21"/>
               </w:rPr>
               <w:t xml:space="preserve">2023 Phase 2 Housing Amendments</w:t>
+            </w:r>
+          </w:p>
+        </w:tc>
+        <w:tc>
+          <w:tcPr>
+            <w:tcW w:w="3580" w:type="dxa"/>
+            <w:shd w:val="clear" w:color="auto" w:fill="FFFDF0"/>
+          </w:tcPr>
+          <w:p>
+            <w:pPr>
+              <w:spacing w:before="0" w:after="0"/>
+            </w:pPr>
+          </w:p>
+        </w:tc>
+      </w:tr>
+      <w:tr>
+        <w:trPr>
+          <w:trHeight w:val="340" w:hRule="atLeast"/>
+        </w:trPr>
+        <w:tc>
+          <w:tcPr>
+            <w:tcW w:w="2200" w:type="dxa"/>
+          </w:tcPr>
+          <w:p>
+            <w:pPr>
+              <w:spacing w:before="0" w:after="0"/>
+            </w:pPr>
+            <w:r>
+              <w:rPr>
+                <w:b/>
+                <w:color w:val="075481"/>
+                <w:sz w:val="21"/>
+                <w:szCs w:val="21"/>
+              </w:rPr>
+              <w:t xml:space="preserve">T133</w:t>
+            </w:r>
+          </w:p>
+        </w:tc>
+        <w:tc>
+          <w:tcPr>
+            <w:tcW w:w="4300" w:type="dxa"/>
+          </w:tcPr>
+          <w:p>
+            <w:pPr>
+              <w:spacing w:before="0" w:after="0"/>
+            </w:pPr>
+            <w:r>
+              <w:rPr>
+                <w:sz w:val="21"/>
+                <w:szCs w:val="21"/>
+              </w:rPr>
+              <w:t xml:space="preserve">2021 Phase 1 Housing Amendments</w:t>
+            </w:r>
+          </w:p>
+        </w:tc>
+        <w:tc>
+          <w:tcPr>
+            <w:tcW w:w="3580" w:type="dxa"/>
+            <w:shd w:val="clear" w:color="auto" w:fill="FFFDF0"/>
+          </w:tcPr>
+          <w:p>
+            <w:pPr>
+              <w:spacing w:before="0" w:after="0"/>
+            </w:pPr>
+          </w:p>
+        </w:tc>
+      </w:tr>
+      <w:tr>
+        <w:tc>
+          <w:tcPr>
+            <w:tcW w:w="10080" w:type="dxa"/>
+            <w:gridSpan w:val="3"/>
+            <w:shd w:val="clear" w:color="auto" w:fill="EDF4FA"/>
+          </w:tcPr>
+          <w:p>
+            <w:pPr>
+              <w:spacing w:before="0" w:after="0"/>
+            </w:pPr>
+            <w:r>
+              <w:rPr>
+                <w:i/>
+                <w:color w:val="595959"/>
+                <w:sz w:val="19"/>
+                <w:szCs w:val="19"/>
+              </w:rPr>
+              <w:t xml:space="preserve">The sentence under each milestone, shown in the list below the chart:</w:t>
+            </w:r>
+          </w:p>
+        </w:tc>
+      </w:tr>
+      <w:tr>
+        <w:trPr>
+          <w:trHeight w:val="340" w:hRule="atLeast"/>
+        </w:trPr>
+        <w:tc>
+          <w:tcPr>
+            <w:tcW w:w="2200" w:type="dxa"/>
+          </w:tcPr>
+          <w:p>
+            <w:pPr>
+              <w:spacing w:before="0" w:after="0"/>
+            </w:pPr>
+            <w:r>
+              <w:rPr>
+                <w:b/>
+                <w:color w:val="075481"/>
+                <w:sz w:val="21"/>
+                <w:szCs w:val="21"/>
+              </w:rPr>
+              <w:t xml:space="preserve">T134</w:t>
+            </w:r>
+          </w:p>
+          <w:p>
+            <w:pPr>
+              <w:spacing w:before="0" w:after="0"/>
+            </w:pPr>
+            <w:r>
+              <w:rPr>
+                <w:color w:val="595959"/>
+                <w:sz w:val="17"/>
+                <w:szCs w:val="17"/>
+              </w:rPr>
+              <w:t xml:space="preserve">Under 2012 Regional Plan Update</w:t>
+            </w:r>
+          </w:p>
+        </w:tc>
+        <w:tc>
+          <w:tcPr>
+            <w:tcW w:w="4300" w:type="dxa"/>
+          </w:tcPr>
+          <w:p>
+            <w:pPr>
+              <w:spacing w:before="0" w:after="0"/>
+            </w:pPr>
+            <w:r>
+              <w:rPr>
+                <w:sz w:val="21"/>
+                <w:szCs w:val="21"/>
+              </w:rPr>
+              <w:t xml:space="preserve">The updated Regional Plan set the framework that later housing incentives build on.</w:t>
+            </w:r>
+          </w:p>
+        </w:tc>
+        <w:tc>
+          <w:tcPr>
+            <w:tcW w:w="3580" w:type="dxa"/>
+            <w:shd w:val="clear" w:color="auto" w:fill="FFFDF0"/>
+          </w:tcPr>
+          <w:p>
+            <w:pPr>
+              <w:spacing w:before="0" w:after="0"/>
+            </w:pPr>
+          </w:p>
+        </w:tc>
+      </w:tr>
+      <w:tr>
+        <w:trPr>
+          <w:trHeight w:val="340" w:hRule="atLeast"/>
+        </w:trPr>
+        <w:tc>
+          <w:tcPr>
+            <w:tcW w:w="2200" w:type="dxa"/>
+          </w:tcPr>
+          <w:p>
+            <w:pPr>
+              <w:spacing w:before="0" w:after="0"/>
+            </w:pPr>
+            <w:r>
+              <w:rPr>
+                <w:b/>
+                <w:color w:val="075481"/>
+                <w:sz w:val="21"/>
+                <w:szCs w:val="21"/>
+              </w:rPr>
+              <w:t xml:space="preserve">T135</w:t>
+            </w:r>
+          </w:p>
+          <w:p>
+            <w:pPr>
+              <w:spacing w:before="0" w:after="0"/>
+            </w:pPr>
+            <w:r>
+              <w:rPr>
+                <w:color w:val="595959"/>
+                <w:sz w:val="17"/>
+                <w:szCs w:val="17"/>
+              </w:rPr>
+              <w:t xml:space="preserve">Under 2018 Development Rights Strategic Initiative</w:t>
+            </w:r>
+          </w:p>
+        </w:tc>
+        <w:tc>
+          <w:tcPr>
+            <w:tcW w:w="4300" w:type="dxa"/>
+          </w:tcPr>
+          <w:p>
+            <w:pPr>
+              <w:spacing w:before="0" w:after="0"/>
+            </w:pPr>
+            <w:r>
+              <w:rPr>
+                <w:sz w:val="21"/>
+                <w:szCs w:val="21"/>
+              </w:rPr>
+              <w:t xml:space="preserve">Allowed the conversion of existing development using environmentally neutral conversion rates.</w:t>
+            </w:r>
+          </w:p>
+        </w:tc>
+        <w:tc>
+          <w:tcPr>
+            <w:tcW w:w="3580" w:type="dxa"/>
+            <w:shd w:val="clear" w:color="auto" w:fill="FFFDF0"/>
+          </w:tcPr>
+          <w:p>
+            <w:pPr>
+              <w:spacing w:before="0" w:after="0"/>
+            </w:pPr>
+          </w:p>
+        </w:tc>
+      </w:tr>
+      <w:tr>
+        <w:trPr>
+          <w:trHeight w:val="340" w:hRule="atLeast"/>
+        </w:trPr>
+        <w:tc>
+          <w:tcPr>
+            <w:tcW w:w="2200" w:type="dxa"/>
+          </w:tcPr>
+          <w:p>
+            <w:pPr>
+              <w:spacing w:before="0" w:after="0"/>
+            </w:pPr>
+            <w:r>
+              <w:rPr>
+                <w:b/>
+                <w:color w:val="075481"/>
+                <w:sz w:val="21"/>
+                <w:szCs w:val="21"/>
+              </w:rPr>
+              <w:t xml:space="preserve">T136</w:t>
+            </w:r>
+          </w:p>
+          <w:p>
+            <w:pPr>
+              <w:spacing w:before="0" w:after="0"/>
+            </w:pPr>
+            <w:r>
+              <w:rPr>
+                <w:color w:val="595959"/>
+                <w:sz w:val="17"/>
+                <w:szCs w:val="17"/>
+              </w:rPr>
+              <w:t xml:space="preserve">Under 2021 Phase 1 Housing Amendments</w:t>
+            </w:r>
+          </w:p>
+        </w:tc>
+        <w:tc>
+          <w:tcPr>
+            <w:tcW w:w="4300" w:type="dxa"/>
+          </w:tcPr>
+          <w:p>
+            <w:pPr>
+              <w:spacing w:before="0" w:after="0"/>
+            </w:pPr>
+            <w:r>
+              <w:rPr>
+                <w:sz w:val="21"/>
+                <w:szCs w:val="21"/>
+              </w:rPr>
+              <w:t xml:space="preserve">Made accessory dwelling units easier to build, allowing up to two per residential parcel, and expanded where bonus units can be used.</w:t>
+            </w:r>
+          </w:p>
+        </w:tc>
+        <w:tc>
+          <w:tcPr>
+            <w:tcW w:w="3580" w:type="dxa"/>
+            <w:shd w:val="clear" w:color="auto" w:fill="FFFDF0"/>
+          </w:tcPr>
+          <w:p>
+            <w:pPr>
+              <w:spacing w:before="0" w:after="0"/>
+            </w:pPr>
+          </w:p>
+        </w:tc>
+      </w:tr>
+      <w:tr>
+        <w:trPr>
+          <w:trHeight w:val="340" w:hRule="atLeast"/>
+        </w:trPr>
+        <w:tc>
+          <w:tcPr>
+            <w:tcW w:w="2200" w:type="dxa"/>
+          </w:tcPr>
+          <w:p>
+            <w:pPr>
+              <w:spacing w:before="0" w:after="0"/>
+            </w:pPr>
+            <w:r>
+              <w:rPr>
+                <w:b/>
+                <w:color w:val="075481"/>
+                <w:sz w:val="21"/>
+                <w:szCs w:val="21"/>
+              </w:rPr>
+              <w:t xml:space="preserve">T137</w:t>
+            </w:r>
+          </w:p>
+          <w:p>
+            <w:pPr>
+              <w:spacing w:before="0" w:after="0"/>
+            </w:pPr>
+            <w:r>
+              <w:rPr>
+                <w:color w:val="595959"/>
+                <w:sz w:val="17"/>
+                <w:szCs w:val="17"/>
+              </w:rPr>
+              <w:t xml:space="preserve">Under 2023 Phase 2 Housing Amendments</w:t>
+            </w:r>
+          </w:p>
+        </w:tc>
+        <w:tc>
+          <w:tcPr>
+            <w:tcW w:w="4300" w:type="dxa"/>
+          </w:tcPr>
+          <w:p>
+            <w:pPr>
+              <w:spacing w:before="0" w:after="0"/>
+            </w:pPr>
+            <w:r>
+              <w:rPr>
+                <w:sz w:val="21"/>
+                <w:szCs w:val="21"/>
+              </w:rPr>
+              <w:t xml:space="preserve">Gave deed-restricted housing more height, density, and coverage flexibility in and near town centers.</w:t>
+            </w:r>
+          </w:p>
+        </w:tc>
+        <w:tc>
+          <w:tcPr>
+            <w:tcW w:w="3580" w:type="dxa"/>
+            <w:shd w:val="clear" w:color="auto" w:fill="FFFDF0"/>
+          </w:tcPr>
+          <w:p>
+            <w:pPr>
+              <w:spacing w:before="0" w:after="0"/>
+            </w:pPr>
+          </w:p>
+        </w:tc>
+      </w:tr>
+      <w:tr>
+        <w:tc>
+          <w:tcPr>
+            <w:tcW w:w="10080" w:type="dxa"/>
+            <w:gridSpan w:val="3"/>
+            <w:shd w:val="clear" w:color="auto" w:fill="EDF4FA"/>
+          </w:tcPr>
+          <w:p>
+            <w:pPr>
+              <w:spacing w:before="0" w:after="0"/>
+            </w:pPr>
+            <w:r>
+              <w:rPr>
+                <w:i/>
+                <w:color w:val="595959"/>
+                <w:sz w:val="19"/>
+                <w:szCs w:val="19"/>
+              </w:rPr>
+              <w:t xml:space="preserve">The three bars on this chart:</w:t>
+            </w:r>
+          </w:p>
+        </w:tc>
+      </w:tr>
+      <w:tr>
+        <w:trPr>
+          <w:trHeight w:val="340" w:hRule="atLeast"/>
+        </w:trPr>
+        <w:tc>
+          <w:tcPr>
+            <w:tcW w:w="2200" w:type="dxa"/>
+          </w:tcPr>
+          <w:p>
+            <w:pPr>
+              <w:spacing w:before="0" w:after="0"/>
+            </w:pPr>
+            <w:r>
+              <w:rPr>
+                <w:b/>
+                <w:color w:val="075481"/>
+                <w:sz w:val="21"/>
+                <w:szCs w:val="21"/>
+              </w:rPr>
+              <w:t xml:space="preserve">T138</w:t>
+            </w:r>
+          </w:p>
+        </w:tc>
+        <w:tc>
+          <w:tcPr>
+            <w:tcW w:w="4300" w:type="dxa"/>
+          </w:tcPr>
+          <w:p>
+            <w:pPr>
+              <w:spacing w:before="0" w:after="0"/>
+            </w:pPr>
+            <w:r>
+              <w:rPr>
+                <w:sz w:val="21"/>
+                <w:szCs w:val="21"/>
+              </w:rPr>
+              <w:t xml:space="preserve">Deed-restricted units</w:t>
+            </w:r>
+          </w:p>
+        </w:tc>
+        <w:tc>
+          <w:tcPr>
+            <w:tcW w:w="3580" w:type="dxa"/>
+            <w:shd w:val="clear" w:color="auto" w:fill="FFFDF0"/>
+          </w:tcPr>
+          <w:p>
+            <w:pPr>
+              <w:spacing w:before="0" w:after="0"/>
+            </w:pPr>
+          </w:p>
+        </w:tc>
+      </w:tr>
+      <w:tr>
+        <w:trPr>
+          <w:trHeight w:val="340" w:hRule="atLeast"/>
+        </w:trPr>
+        <w:tc>
+          <w:tcPr>
+            <w:tcW w:w="2200" w:type="dxa"/>
+          </w:tcPr>
+          <w:p>
+            <w:pPr>
+              <w:spacing w:before="0" w:after="0"/>
+            </w:pPr>
+            <w:r>
+              <w:rPr>
+                <w:b/>
+                <w:color w:val="075481"/>
+                <w:sz w:val="21"/>
+                <w:szCs w:val="21"/>
+              </w:rPr>
+              <w:t xml:space="preserve">T139</w:t>
+            </w:r>
+          </w:p>
+        </w:tc>
+        <w:tc>
+          <w:tcPr>
+            <w:tcW w:w="4300" w:type="dxa"/>
+          </w:tcPr>
+          <w:p>
+            <w:pPr>
+              <w:spacing w:before="0" w:after="0"/>
+            </w:pPr>
+            <w:r>
+              <w:rPr>
+                <w:sz w:val="21"/>
+                <w:szCs w:val="21"/>
+              </w:rPr>
+              <w:t xml:space="preserve">Accessory dwelling units</w:t>
+            </w:r>
+          </w:p>
+        </w:tc>
+        <w:tc>
+          <w:tcPr>
+            <w:tcW w:w="3580" w:type="dxa"/>
+            <w:shd w:val="clear" w:color="auto" w:fill="FFFDF0"/>
+          </w:tcPr>
+          <w:p>
+            <w:pPr>
+              <w:spacing w:before="0" w:after="0"/>
+            </w:pPr>
+          </w:p>
+        </w:tc>
+      </w:tr>
+      <w:tr>
+        <w:trPr>
+          <w:trHeight w:val="340" w:hRule="atLeast"/>
+        </w:trPr>
+        <w:tc>
+          <w:tcPr>
+            <w:tcW w:w="2200" w:type="dxa"/>
+          </w:tcPr>
+          <w:p>
+            <w:pPr>
+              <w:spacing w:before="0" w:after="0"/>
+            </w:pPr>
+            <w:r>
+              <w:rPr>
+                <w:b/>
+                <w:color w:val="075481"/>
+                <w:sz w:val="21"/>
+                <w:szCs w:val="21"/>
+              </w:rPr>
+              <w:t xml:space="preserve">T140</w:t>
+            </w:r>
+          </w:p>
+        </w:tc>
+        <w:tc>
+          <w:tcPr>
+            <w:tcW w:w="4300" w:type="dxa"/>
+          </w:tcPr>
+          <w:p>
+            <w:pPr>
+              <w:spacing w:before="0" w:after="0"/>
+            </w:pPr>
+            <w:r>
+              <w:rPr>
+                <w:sz w:val="21"/>
+                <w:szCs w:val="21"/>
+              </w:rPr>
+              <w:t xml:space="preserve">Other affordable and workforce</w:t>
             </w:r>
           </w:p>
         </w:tc>
@@ -7556,7 +7498,7 @@
           <w:sz w:val="26"/>
           <w:szCs w:val="26"/>
         </w:rPr>
-        <w:t xml:space="preserve">9. Data table</w:t>
+        <w:t xml:space="preserve">9. Map pop-up</w:t>
       </w:r>
     </w:p>
     <w:tbl>
@@ -7649,266 +7591,6 @@
         </w:tc>
       </w:tr>
       <w:tr>
-        <w:trPr>
-          <w:trHeight w:val="340" w:hRule="atLeast"/>
-        </w:trPr>
-        <w:tc>
-          <w:tcPr>
-            <w:tcW w:w="2200" w:type="dxa"/>
-          </w:tcPr>
-          <w:p>
-            <w:pPr>
-              <w:spacing w:before="0" w:after="0"/>
-            </w:pPr>
-            <w:r>
-              <w:rPr>
-                <w:b/>
-                <w:color w:val="075481"/>
-                <w:sz w:val="21"/>
-                <w:szCs w:val="21"/>
-              </w:rPr>
-              <w:t xml:space="preserve">T99</w:t>
-            </w:r>
-          </w:p>
-          <w:p>
-            <w:pPr>
-              <w:spacing w:before="0" w:after="0"/>
-            </w:pPr>
-            <w:r>
-              <w:rPr>
-                <w:color w:val="595959"/>
-                <w:sz w:val="17"/>
-                <w:szCs w:val="17"/>
-              </w:rPr>
-              <w:t xml:space="preserve">Section label</w:t>
-            </w:r>
-          </w:p>
-        </w:tc>
-        <w:tc>
-          <w:tcPr>
-            <w:tcW w:w="4300" w:type="dxa"/>
-          </w:tcPr>
-          <w:p>
-            <w:pPr>
-              <w:spacing w:before="0" w:after="0"/>
-            </w:pPr>
-            <w:r>
-              <w:rPr>
-                <w:sz w:val="21"/>
-                <w:szCs w:val="21"/>
-              </w:rPr>
-              <w:t xml:space="preserve">The data</w:t>
-            </w:r>
-          </w:p>
-        </w:tc>
-        <w:tc>
-          <w:tcPr>
-            <w:tcW w:w="3580" w:type="dxa"/>
-            <w:shd w:val="clear" w:color="auto" w:fill="FFFDF0"/>
-          </w:tcPr>
-          <w:p>
-            <w:pPr>
-              <w:spacing w:before="0" w:after="0"/>
-            </w:pPr>
-          </w:p>
-        </w:tc>
-      </w:tr>
-      <w:tr>
-        <w:trPr>
-          <w:trHeight w:val="340" w:hRule="atLeast"/>
-        </w:trPr>
-        <w:tc>
-          <w:tcPr>
-            <w:tcW w:w="2200" w:type="dxa"/>
-          </w:tcPr>
-          <w:p>
-            <w:pPr>
-              <w:spacing w:before="0" w:after="0"/>
-            </w:pPr>
-            <w:r>
-              <w:rPr>
-                <w:b/>
-                <w:color w:val="075481"/>
-                <w:sz w:val="21"/>
-                <w:szCs w:val="21"/>
-              </w:rPr>
-              <w:t xml:space="preserve">T100</w:t>
-            </w:r>
-          </w:p>
-          <w:p>
-            <w:pPr>
-              <w:spacing w:before="0" w:after="0"/>
-            </w:pPr>
-            <w:r>
-              <w:rPr>
-                <w:color w:val="595959"/>
-                <w:sz w:val="17"/>
-                <w:szCs w:val="17"/>
-              </w:rPr>
-              <w:t xml:space="preserve">Section heading</w:t>
-            </w:r>
-          </w:p>
-        </w:tc>
-        <w:tc>
-          <w:tcPr>
-            <w:tcW w:w="4300" w:type="dxa"/>
-          </w:tcPr>
-          <w:p>
-            <w:pPr>
-              <w:spacing w:before="0" w:after="0"/>
-            </w:pPr>
-            <w:r>
-              <w:rPr>
-                <w:sz w:val="21"/>
-                <w:szCs w:val="21"/>
-              </w:rPr>
-              <w:t xml:space="preserve">Every multi-family housing record</w:t>
-            </w:r>
-          </w:p>
-        </w:tc>
-        <w:tc>
-          <w:tcPr>
-            <w:tcW w:w="3580" w:type="dxa"/>
-            <w:shd w:val="clear" w:color="auto" w:fill="FFFDF0"/>
-          </w:tcPr>
-          <w:p>
-            <w:pPr>
-              <w:spacing w:before="0" w:after="0"/>
-            </w:pPr>
-          </w:p>
-        </w:tc>
-      </w:tr>
-      <w:tr>
-        <w:trPr>
-          <w:trHeight w:val="340" w:hRule="atLeast"/>
-        </w:trPr>
-        <w:tc>
-          <w:tcPr>
-            <w:tcW w:w="2200" w:type="dxa"/>
-          </w:tcPr>
-          <w:p>
-            <w:pPr>
-              <w:spacing w:before="0" w:after="0"/>
-            </w:pPr>
-            <w:r>
-              <w:rPr>
-                <w:b/>
-                <w:color w:val="075481"/>
-                <w:sz w:val="21"/>
-                <w:szCs w:val="21"/>
-              </w:rPr>
-              <w:t xml:space="preserve">T101</w:t>
-            </w:r>
-          </w:p>
-          <w:p>
-            <w:pPr>
-              <w:spacing w:before="0" w:after="0"/>
-            </w:pPr>
-            <w:r>
-              <w:rPr>
-                <w:color w:val="595959"/>
-                <w:sz w:val="17"/>
-                <w:szCs w:val="17"/>
-              </w:rPr>
-              <w:t xml:space="preserve">Note above the table</w:t>
-            </w:r>
-          </w:p>
-        </w:tc>
-        <w:tc>
-          <w:tcPr>
-            <w:tcW w:w="4300" w:type="dxa"/>
-          </w:tcPr>
-          <w:p>
-            <w:pPr>
-              <w:spacing w:before="0" w:after="0"/>
-            </w:pPr>
-            <w:r>
-              <w:rPr>
-                <w:sz w:val="21"/>
-                <w:szCs w:val="21"/>
-              </w:rPr>
-              <w:t xml:space="preserve">One row per housing record. A parcel can have more than one record.</w:t>
-            </w:r>
-          </w:p>
-        </w:tc>
-        <w:tc>
-          <w:tcPr>
-            <w:tcW w:w="3580" w:type="dxa"/>
-            <w:shd w:val="clear" w:color="auto" w:fill="FFFDF0"/>
-          </w:tcPr>
-          <w:p>
-            <w:pPr>
-              <w:spacing w:before="0" w:after="0"/>
-            </w:pPr>
-          </w:p>
-        </w:tc>
-      </w:tr>
-      <w:tr>
-        <w:trPr>
-          <w:trHeight w:val="340" w:hRule="atLeast"/>
-        </w:trPr>
-        <w:tc>
-          <w:tcPr>
-            <w:tcW w:w="2200" w:type="dxa"/>
-          </w:tcPr>
-          <w:p>
-            <w:pPr>
-              <w:spacing w:before="0" w:after="0"/>
-            </w:pPr>
-            <w:r>
-              <w:rPr>
-                <w:b/>
-                <w:color w:val="075481"/>
-                <w:sz w:val="21"/>
-                <w:szCs w:val="21"/>
-              </w:rPr>
-              <w:t xml:space="preserve">T102</w:t>
-            </w:r>
-          </w:p>
-          <w:p>
-            <w:pPr>
-              <w:spacing w:before="0" w:after="0"/>
-            </w:pPr>
-            <w:r>
-              <w:rPr>
-                <w:color w:val="595959"/>
-                <w:sz w:val="17"/>
-                <w:szCs w:val="17"/>
-              </w:rPr>
-              <w:t xml:space="preserve">Download button</w:t>
-            </w:r>
-          </w:p>
-        </w:tc>
-        <w:tc>
-          <w:tcPr>
-            <w:tcW w:w="4300" w:type="dxa"/>
-          </w:tcPr>
-          <w:p>
-            <w:pPr>
-              <w:spacing w:before="0" w:after="0"/>
-            </w:pPr>
-            <w:r>
-              <w:rPr>
-                <w:sz w:val="21"/>
-                <w:szCs w:val="21"/>
-              </w:rPr>
-              <w:t xml:space="preserve">Export CSV</w:t>
-            </w:r>
-          </w:p>
-        </w:tc>
-        <w:tc>
-          <w:tcPr>
-            <w:tcW w:w="3580" w:type="dxa"/>
-            <w:shd w:val="clear" w:color="auto" w:fill="FFFDF0"/>
-          </w:tcPr>
-          <w:p>
-            <w:pPr>
-              <w:spacing w:before="0" w:after="0"/>
-            </w:pPr>
-          </w:p>
-        </w:tc>
-      </w:tr>
-      <w:tr>
         <w:tc>
           <w:tcPr>
             <w:tcW w:w="10080" w:type="dxa"/>
@@ -7926,932 +7608,126 @@
                 <w:sz w:val="19"/>
                 <w:szCs w:val="19"/>
               </w:rPr>
-              <w:t xml:space="preserve">Column headings, left to right:</w:t>
-            </w:r>
-          </w:p>
-        </w:tc>
-      </w:tr>
-      <w:tr>
-        <w:trPr>
-          <w:trHeight w:val="340" w:hRule="atLeast"/>
-        </w:trPr>
-        <w:tc>
-          <w:tcPr>
-            <w:tcW w:w="2200" w:type="dxa"/>
-          </w:tcPr>
-          <w:p>
-            <w:pPr>
-              <w:spacing w:before="0" w:after="0"/>
-            </w:pPr>
-            <w:r>
-              <w:rPr>
-                <w:b/>
-                <w:color w:val="075481"/>
-                <w:sz w:val="21"/>
-                <w:szCs w:val="21"/>
-              </w:rPr>
-              <w:t xml:space="preserve">T103</w:t>
-            </w:r>
-          </w:p>
-        </w:tc>
-        <w:tc>
-          <w:tcPr>
-            <w:tcW w:w="4300" w:type="dxa"/>
-          </w:tcPr>
-          <w:p>
-            <w:pPr>
-              <w:spacing w:before="0" w:after="0"/>
-            </w:pPr>
-            <w:r>
-              <w:rPr>
-                <w:sz w:val="21"/>
-                <w:szCs w:val="21"/>
-              </w:rPr>
-              <w:t xml:space="preserve">APN</w:t>
-            </w:r>
-          </w:p>
-        </w:tc>
-        <w:tc>
-          <w:tcPr>
-            <w:tcW w:w="3580" w:type="dxa"/>
-            <w:shd w:val="clear" w:color="auto" w:fill="FFFDF0"/>
-          </w:tcPr>
-          <w:p>
-            <w:pPr>
-              <w:spacing w:before="0" w:after="0"/>
-            </w:pPr>
-          </w:p>
-        </w:tc>
-      </w:tr>
-      <w:tr>
-        <w:trPr>
-          <w:trHeight w:val="340" w:hRule="atLeast"/>
-        </w:trPr>
-        <w:tc>
-          <w:tcPr>
-            <w:tcW w:w="2200" w:type="dxa"/>
-          </w:tcPr>
-          <w:p>
-            <w:pPr>
-              <w:spacing w:before="0" w:after="0"/>
-            </w:pPr>
-            <w:r>
-              <w:rPr>
-                <w:b/>
-                <w:color w:val="075481"/>
-                <w:sz w:val="21"/>
-                <w:szCs w:val="21"/>
-              </w:rPr>
-              <w:t xml:space="preserve">T104</w:t>
-            </w:r>
-          </w:p>
-        </w:tc>
-        <w:tc>
-          <w:tcPr>
-            <w:tcW w:w="4300" w:type="dxa"/>
-          </w:tcPr>
-          <w:p>
-            <w:pPr>
-              <w:spacing w:before="0" w:after="0"/>
-            </w:pPr>
-            <w:r>
-              <w:rPr>
-                <w:sz w:val="21"/>
-                <w:szCs w:val="21"/>
-              </w:rPr>
-              <w:t xml:space="preserve">Jurisdiction</w:t>
-            </w:r>
-          </w:p>
-        </w:tc>
-        <w:tc>
-          <w:tcPr>
-            <w:tcW w:w="3580" w:type="dxa"/>
-            <w:shd w:val="clear" w:color="auto" w:fill="FFFDF0"/>
-          </w:tcPr>
-          <w:p>
-            <w:pPr>
-              <w:spacing w:before="0" w:after="0"/>
-            </w:pPr>
-          </w:p>
-        </w:tc>
-      </w:tr>
-      <w:tr>
-        <w:trPr>
-          <w:trHeight w:val="340" w:hRule="atLeast"/>
-        </w:trPr>
-        <w:tc>
-          <w:tcPr>
-            <w:tcW w:w="2200" w:type="dxa"/>
-          </w:tcPr>
-          <w:p>
-            <w:pPr>
-              <w:spacing w:before="0" w:after="0"/>
-            </w:pPr>
-            <w:r>
-              <w:rPr>
-                <w:b/>
-                <w:color w:val="075481"/>
-                <w:sz w:val="21"/>
-                <w:szCs w:val="21"/>
-              </w:rPr>
-              <w:t xml:space="preserve">T105</w:t>
-            </w:r>
-          </w:p>
-        </w:tc>
-        <w:tc>
-          <w:tcPr>
-            <w:tcW w:w="4300" w:type="dxa"/>
-          </w:tcPr>
-          <w:p>
-            <w:pPr>
-              <w:spacing w:before="0" w:after="0"/>
-            </w:pPr>
-            <w:r>
-              <w:rPr>
-                <w:sz w:val="21"/>
-                <w:szCs w:val="21"/>
-              </w:rPr>
-              <w:t xml:space="preserve">Address</w:t>
-            </w:r>
-          </w:p>
-        </w:tc>
-        <w:tc>
-          <w:tcPr>
-            <w:tcW w:w="3580" w:type="dxa"/>
-            <w:shd w:val="clear" w:color="auto" w:fill="FFFDF0"/>
-          </w:tcPr>
-          <w:p>
-            <w:pPr>
-              <w:spacing w:before="0" w:after="0"/>
-            </w:pPr>
-          </w:p>
-        </w:tc>
-      </w:tr>
-      <w:tr>
-        <w:trPr>
-          <w:trHeight w:val="340" w:hRule="atLeast"/>
-        </w:trPr>
-        <w:tc>
-          <w:tcPr>
-            <w:tcW w:w="2200" w:type="dxa"/>
-          </w:tcPr>
-          <w:p>
-            <w:pPr>
-              <w:spacing w:before="0" w:after="0"/>
-            </w:pPr>
-            <w:r>
-              <w:rPr>
-                <w:b/>
-                <w:color w:val="075481"/>
-                <w:sz w:val="21"/>
-                <w:szCs w:val="21"/>
-              </w:rPr>
-              <w:t xml:space="preserve">T106</w:t>
-            </w:r>
-          </w:p>
-        </w:tc>
-        <w:tc>
-          <w:tcPr>
-            <w:tcW w:w="4300" w:type="dxa"/>
-          </w:tcPr>
-          <w:p>
-            <w:pPr>
-              <w:spacing w:before="0" w:after="0"/>
-            </w:pPr>
-            <w:r>
-              <w:rPr>
-                <w:sz w:val="21"/>
-                <w:szCs w:val="21"/>
-              </w:rPr>
-              <w:t xml:space="preserve">Town</w:t>
-            </w:r>
-          </w:p>
-        </w:tc>
-        <w:tc>
-          <w:tcPr>
-            <w:tcW w:w="3580" w:type="dxa"/>
-            <w:shd w:val="clear" w:color="auto" w:fill="FFFDF0"/>
-          </w:tcPr>
-          <w:p>
-            <w:pPr>
-              <w:spacing w:before="0" w:after="0"/>
-            </w:pPr>
-          </w:p>
-        </w:tc>
-      </w:tr>
-      <w:tr>
-        <w:trPr>
-          <w:trHeight w:val="340" w:hRule="atLeast"/>
-        </w:trPr>
-        <w:tc>
-          <w:tcPr>
-            <w:tcW w:w="2200" w:type="dxa"/>
-          </w:tcPr>
-          <w:p>
-            <w:pPr>
-              <w:spacing w:before="0" w:after="0"/>
-            </w:pPr>
-            <w:r>
-              <w:rPr>
-                <w:b/>
-                <w:color w:val="075481"/>
-                <w:sz w:val="21"/>
-                <w:szCs w:val="21"/>
-              </w:rPr>
-              <w:t xml:space="preserve">T107</w:t>
-            </w:r>
-          </w:p>
-        </w:tc>
-        <w:tc>
-          <w:tcPr>
-            <w:tcW w:w="4300" w:type="dxa"/>
-          </w:tcPr>
-          <w:p>
-            <w:pPr>
-              <w:spacing w:before="0" w:after="0"/>
-            </w:pPr>
-            <w:r>
-              <w:rPr>
-                <w:sz w:val="21"/>
-                <w:szCs w:val="21"/>
-              </w:rPr>
-              <w:t xml:space="preserve">Units</w:t>
-            </w:r>
-          </w:p>
-        </w:tc>
-        <w:tc>
-          <w:tcPr>
-            <w:tcW w:w="3580" w:type="dxa"/>
-            <w:shd w:val="clear" w:color="auto" w:fill="FFFDF0"/>
-          </w:tcPr>
-          <w:p>
-            <w:pPr>
-              <w:spacing w:before="0" w:after="0"/>
-            </w:pPr>
-          </w:p>
-        </w:tc>
-      </w:tr>
-      <w:tr>
-        <w:trPr>
-          <w:trHeight w:val="340" w:hRule="atLeast"/>
-        </w:trPr>
-        <w:tc>
-          <w:tcPr>
-            <w:tcW w:w="2200" w:type="dxa"/>
-          </w:tcPr>
-          <w:p>
-            <w:pPr>
-              <w:spacing w:before="0" w:after="0"/>
-            </w:pPr>
-            <w:r>
-              <w:rPr>
-                <w:b/>
-                <w:color w:val="075481"/>
-                <w:sz w:val="21"/>
-                <w:szCs w:val="21"/>
-              </w:rPr>
-              <w:t xml:space="preserve">T108</w:t>
-            </w:r>
-          </w:p>
-        </w:tc>
-        <w:tc>
-          <w:tcPr>
-            <w:tcW w:w="4300" w:type="dxa"/>
-          </w:tcPr>
-          <w:p>
-            <w:pPr>
-              <w:spacing w:before="0" w:after="0"/>
-            </w:pPr>
-            <w:r>
-              <w:rPr>
-                <w:sz w:val="21"/>
-                <w:szCs w:val="21"/>
-              </w:rPr>
-              <w:t xml:space="preserve">Year Built</w:t>
-            </w:r>
-          </w:p>
-        </w:tc>
-        <w:tc>
-          <w:tcPr>
-            <w:tcW w:w="3580" w:type="dxa"/>
-            <w:shd w:val="clear" w:color="auto" w:fill="FFFDF0"/>
-          </w:tcPr>
-          <w:p>
-            <w:pPr>
-              <w:spacing w:before="0" w:after="0"/>
-            </w:pPr>
-          </w:p>
-        </w:tc>
-      </w:tr>
-      <w:tr>
-        <w:trPr>
-          <w:trHeight w:val="340" w:hRule="atLeast"/>
-        </w:trPr>
-        <w:tc>
-          <w:tcPr>
-            <w:tcW w:w="2200" w:type="dxa"/>
-          </w:tcPr>
-          <w:p>
-            <w:pPr>
-              <w:spacing w:before="0" w:after="0"/>
-            </w:pPr>
-            <w:r>
-              <w:rPr>
-                <w:b/>
-                <w:color w:val="075481"/>
-                <w:sz w:val="21"/>
-                <w:szCs w:val="21"/>
-              </w:rPr>
-              <w:t xml:space="preserve">T109</w:t>
-            </w:r>
-          </w:p>
-        </w:tc>
-        <w:tc>
-          <w:tcPr>
-            <w:tcW w:w="4300" w:type="dxa"/>
-          </w:tcPr>
-          <w:p>
-            <w:pPr>
-              <w:spacing w:before="0" w:after="0"/>
-            </w:pPr>
-            <w:r>
-              <w:rPr>
-                <w:sz w:val="21"/>
-                <w:szCs w:val="21"/>
-              </w:rPr>
-              <w:t xml:space="preserve">Affordable &amp; Workforce</w:t>
-            </w:r>
-          </w:p>
-        </w:tc>
-        <w:tc>
-          <w:tcPr>
-            <w:tcW w:w="3580" w:type="dxa"/>
-            <w:shd w:val="clear" w:color="auto" w:fill="FFFDF0"/>
-          </w:tcPr>
-          <w:p>
-            <w:pPr>
-              <w:spacing w:before="0" w:after="0"/>
-            </w:pPr>
-          </w:p>
-        </w:tc>
-      </w:tr>
-      <w:tr>
-        <w:trPr>
-          <w:trHeight w:val="340" w:hRule="atLeast"/>
-        </w:trPr>
-        <w:tc>
-          <w:tcPr>
-            <w:tcW w:w="2200" w:type="dxa"/>
-          </w:tcPr>
-          <w:p>
-            <w:pPr>
-              <w:spacing w:before="0" w:after="0"/>
-            </w:pPr>
-            <w:r>
-              <w:rPr>
-                <w:b/>
-                <w:color w:val="075481"/>
-                <w:sz w:val="21"/>
-                <w:szCs w:val="21"/>
-              </w:rPr>
-              <w:t xml:space="preserve">T110</w:t>
-            </w:r>
-          </w:p>
-        </w:tc>
-        <w:tc>
-          <w:tcPr>
-            <w:tcW w:w="4300" w:type="dxa"/>
-          </w:tcPr>
-          <w:p>
-            <w:pPr>
-              <w:spacing w:before="0" w:after="0"/>
-            </w:pPr>
-            <w:r>
-              <w:rPr>
-                <w:sz w:val="21"/>
-                <w:szCs w:val="21"/>
-              </w:rPr>
-              <w:t xml:space="preserve">Timing</w:t>
-            </w:r>
-          </w:p>
-        </w:tc>
-        <w:tc>
-          <w:tcPr>
-            <w:tcW w:w="3580" w:type="dxa"/>
-            <w:shd w:val="clear" w:color="auto" w:fill="FFFDF0"/>
-          </w:tcPr>
-          <w:p>
-            <w:pPr>
-              <w:spacing w:before="0" w:after="0"/>
-            </w:pPr>
-          </w:p>
-        </w:tc>
-      </w:tr>
-      <w:tr>
-        <w:trPr>
-          <w:trHeight w:val="340" w:hRule="atLeast"/>
-        </w:trPr>
-        <w:tc>
-          <w:tcPr>
-            <w:tcW w:w="2200" w:type="dxa"/>
-          </w:tcPr>
-          <w:p>
-            <w:pPr>
-              <w:spacing w:before="0" w:after="0"/>
-            </w:pPr>
-            <w:r>
-              <w:rPr>
-                <w:b/>
-                <w:color w:val="075481"/>
-                <w:sz w:val="21"/>
-                <w:szCs w:val="21"/>
-              </w:rPr>
-              <w:t xml:space="preserve">T111</w:t>
-            </w:r>
-          </w:p>
-        </w:tc>
-        <w:tc>
-          <w:tcPr>
-            <w:tcW w:w="4300" w:type="dxa"/>
-          </w:tcPr>
-          <w:p>
-            <w:pPr>
-              <w:spacing w:before="0" w:after="0"/>
-            </w:pPr>
-            <w:r>
-              <w:rPr>
-                <w:sz w:val="21"/>
-                <w:szCs w:val="21"/>
-              </w:rPr>
-              <w:t xml:space="preserve">Housing Type</w:t>
-            </w:r>
-          </w:p>
-        </w:tc>
-        <w:tc>
-          <w:tcPr>
-            <w:tcW w:w="3580" w:type="dxa"/>
-            <w:shd w:val="clear" w:color="auto" w:fill="FFFDF0"/>
-          </w:tcPr>
-          <w:p>
-            <w:pPr>
-              <w:spacing w:before="0" w:after="0"/>
-            </w:pPr>
-          </w:p>
-        </w:tc>
-      </w:tr>
-      <w:tr>
-        <w:trPr>
-          <w:trHeight w:val="340" w:hRule="atLeast"/>
-        </w:trPr>
-        <w:tc>
-          <w:tcPr>
-            <w:tcW w:w="2200" w:type="dxa"/>
-          </w:tcPr>
-          <w:p>
-            <w:pPr>
-              <w:spacing w:before="0" w:after="0"/>
-            </w:pPr>
-            <w:r>
-              <w:rPr>
-                <w:b/>
-                <w:color w:val="075481"/>
-                <w:sz w:val="21"/>
-                <w:szCs w:val="21"/>
-              </w:rPr>
-              <w:t xml:space="preserve">T112</w:t>
-            </w:r>
-          </w:p>
-        </w:tc>
-        <w:tc>
-          <w:tcPr>
-            <w:tcW w:w="4300" w:type="dxa"/>
-          </w:tcPr>
-          <w:p>
-            <w:pPr>
-              <w:spacing w:before="0" w:after="0"/>
-            </w:pPr>
-            <w:r>
-              <w:rPr>
-                <w:sz w:val="21"/>
-                <w:szCs w:val="21"/>
-              </w:rPr>
-              <w:t xml:space="preserve">VHR</w:t>
-            </w:r>
-          </w:p>
-        </w:tc>
-        <w:tc>
-          <w:tcPr>
-            <w:tcW w:w="3580" w:type="dxa"/>
-            <w:shd w:val="clear" w:color="auto" w:fill="FFFDF0"/>
-          </w:tcPr>
-          <w:p>
-            <w:pPr>
-              <w:spacing w:before="0" w:after="0"/>
-            </w:pPr>
-          </w:p>
-        </w:tc>
-      </w:tr>
-      <w:tr>
-        <w:trPr>
-          <w:trHeight w:val="340" w:hRule="atLeast"/>
-        </w:trPr>
-        <w:tc>
-          <w:tcPr>
-            <w:tcW w:w="2200" w:type="dxa"/>
-          </w:tcPr>
-          <w:p>
-            <w:pPr>
-              <w:spacing w:before="0" w:after="0"/>
-            </w:pPr>
-            <w:r>
-              <w:rPr>
-                <w:b/>
-                <w:color w:val="075481"/>
-                <w:sz w:val="21"/>
-                <w:szCs w:val="21"/>
-              </w:rPr>
-              <w:t xml:space="preserve">T113</w:t>
-            </w:r>
-          </w:p>
-        </w:tc>
-        <w:tc>
-          <w:tcPr>
-            <w:tcW w:w="4300" w:type="dxa"/>
-          </w:tcPr>
-          <w:p>
-            <w:pPr>
-              <w:spacing w:before="0" w:after="0"/>
-            </w:pPr>
-            <w:r>
-              <w:rPr>
-                <w:sz w:val="21"/>
-                <w:szCs w:val="21"/>
-              </w:rPr>
-              <w:t xml:space="preserve">County Land Use</w:t>
-            </w:r>
-          </w:p>
-        </w:tc>
-        <w:tc>
-          <w:tcPr>
-            <w:tcW w:w="3580" w:type="dxa"/>
-            <w:shd w:val="clear" w:color="auto" w:fill="FFFDF0"/>
-          </w:tcPr>
-          <w:p>
-            <w:pPr>
-              <w:spacing w:before="0" w:after="0"/>
-            </w:pPr>
-          </w:p>
-        </w:tc>
-      </w:tr>
-      <w:tr>
-        <w:trPr>
-          <w:trHeight w:val="340" w:hRule="atLeast"/>
-        </w:trPr>
-        <w:tc>
-          <w:tcPr>
-            <w:tcW w:w="2200" w:type="dxa"/>
-          </w:tcPr>
-          <w:p>
-            <w:pPr>
-              <w:spacing w:before="0" w:after="0"/>
-            </w:pPr>
-            <w:r>
-              <w:rPr>
-                <w:b/>
-                <w:color w:val="075481"/>
-                <w:sz w:val="21"/>
-                <w:szCs w:val="21"/>
-              </w:rPr>
-              <w:t xml:space="preserve">T114</w:t>
-            </w:r>
-          </w:p>
-        </w:tc>
-        <w:tc>
-          <w:tcPr>
-            <w:tcW w:w="4300" w:type="dxa"/>
-          </w:tcPr>
-          <w:p>
-            <w:pPr>
-              <w:spacing w:before="0" w:after="0"/>
-            </w:pPr>
-            <w:r>
-              <w:rPr>
-                <w:sz w:val="21"/>
-                <w:szCs w:val="21"/>
-              </w:rPr>
-              <w:t xml:space="preserve">Zoning</w:t>
-            </w:r>
-          </w:p>
-        </w:tc>
-        <w:tc>
-          <w:tcPr>
-            <w:tcW w:w="3580" w:type="dxa"/>
-            <w:shd w:val="clear" w:color="auto" w:fill="FFFDF0"/>
-          </w:tcPr>
-          <w:p>
-            <w:pPr>
-              <w:spacing w:before="0" w:after="0"/>
-            </w:pPr>
-          </w:p>
-        </w:tc>
-      </w:tr>
-      <w:tr>
-        <w:trPr>
-          <w:trHeight w:val="340" w:hRule="atLeast"/>
-        </w:trPr>
-        <w:tc>
-          <w:tcPr>
-            <w:tcW w:w="2200" w:type="dxa"/>
-          </w:tcPr>
-          <w:p>
-            <w:pPr>
-              <w:spacing w:before="0" w:after="0"/>
-            </w:pPr>
-            <w:r>
-              <w:rPr>
-                <w:b/>
-                <w:color w:val="075481"/>
-                <w:sz w:val="21"/>
-                <w:szCs w:val="21"/>
-              </w:rPr>
-              <w:t xml:space="preserve">T115</w:t>
-            </w:r>
-          </w:p>
-        </w:tc>
-        <w:tc>
-          <w:tcPr>
-            <w:tcW w:w="4300" w:type="dxa"/>
-          </w:tcPr>
-          <w:p>
-            <w:pPr>
-              <w:spacing w:before="0" w:after="0"/>
-            </w:pPr>
-            <w:r>
-              <w:rPr>
-                <w:sz w:val="21"/>
-                <w:szCs w:val="21"/>
-              </w:rPr>
-              <w:t xml:space="preserve">Plan</w:t>
-            </w:r>
-          </w:p>
-        </w:tc>
-        <w:tc>
-          <w:tcPr>
-            <w:tcW w:w="3580" w:type="dxa"/>
-            <w:shd w:val="clear" w:color="auto" w:fill="FFFDF0"/>
-          </w:tcPr>
-          <w:p>
-            <w:pPr>
-              <w:spacing w:before="0" w:after="0"/>
-            </w:pPr>
-          </w:p>
-        </w:tc>
-      </w:tr>
-      <w:tr>
-        <w:trPr>
-          <w:trHeight w:val="340" w:hRule="atLeast"/>
-        </w:trPr>
-        <w:tc>
-          <w:tcPr>
-            <w:tcW w:w="2200" w:type="dxa"/>
-          </w:tcPr>
-          <w:p>
-            <w:pPr>
-              <w:spacing w:before="0" w:after="0"/>
-            </w:pPr>
-            <w:r>
-              <w:rPr>
-                <w:b/>
-                <w:color w:val="075481"/>
-                <w:sz w:val="21"/>
-                <w:szCs w:val="21"/>
-              </w:rPr>
-              <w:t xml:space="preserve">T116</w:t>
-            </w:r>
-          </w:p>
-        </w:tc>
-        <w:tc>
-          <w:tcPr>
-            <w:tcW w:w="4300" w:type="dxa"/>
-          </w:tcPr>
-          <w:p>
-            <w:pPr>
-              <w:spacing w:before="0" w:after="0"/>
-            </w:pPr>
-            <w:r>
-              <w:rPr>
-                <w:sz w:val="21"/>
-                <w:szCs w:val="21"/>
-              </w:rPr>
-              <w:t xml:space="preserve">Town Center Proximity</w:t>
-            </w:r>
-          </w:p>
-        </w:tc>
-        <w:tc>
-          <w:tcPr>
-            <w:tcW w:w="3580" w:type="dxa"/>
-            <w:shd w:val="clear" w:color="auto" w:fill="FFFDF0"/>
-          </w:tcPr>
-          <w:p>
-            <w:pPr>
-              <w:spacing w:before="0" w:after="0"/>
-            </w:pPr>
-          </w:p>
-        </w:tc>
-      </w:tr>
-      <w:tr>
-        <w:trPr>
-          <w:trHeight w:val="340" w:hRule="atLeast"/>
-        </w:trPr>
-        <w:tc>
-          <w:tcPr>
-            <w:tcW w:w="2200" w:type="dxa"/>
-          </w:tcPr>
-          <w:p>
-            <w:pPr>
-              <w:spacing w:before="0" w:after="0"/>
-            </w:pPr>
-            <w:r>
-              <w:rPr>
-                <w:b/>
-                <w:color w:val="075481"/>
-                <w:sz w:val="21"/>
-                <w:szCs w:val="21"/>
-              </w:rPr>
-              <w:t xml:space="preserve">T117</w:t>
-            </w:r>
-          </w:p>
-        </w:tc>
-        <w:tc>
-          <w:tcPr>
-            <w:tcW w:w="4300" w:type="dxa"/>
-          </w:tcPr>
-          <w:p>
-            <w:pPr>
-              <w:spacing w:before="0" w:after="0"/>
-            </w:pPr>
-            <w:r>
-              <w:rPr>
-                <w:sz w:val="21"/>
-                <w:szCs w:val="21"/>
-              </w:rPr>
-              <w:t xml:space="preserve">Acres</w:t>
-            </w:r>
-          </w:p>
-        </w:tc>
-        <w:tc>
-          <w:tcPr>
-            <w:tcW w:w="3580" w:type="dxa"/>
-            <w:shd w:val="clear" w:color="auto" w:fill="FFFDF0"/>
-          </w:tcPr>
-          <w:p>
-            <w:pPr>
-              <w:spacing w:before="0" w:after="0"/>
-            </w:pPr>
-          </w:p>
-        </w:tc>
-      </w:tr>
-      <w:tr>
-        <w:trPr>
-          <w:trHeight w:val="340" w:hRule="atLeast"/>
-        </w:trPr>
-        <w:tc>
-          <w:tcPr>
-            <w:tcW w:w="2200" w:type="dxa"/>
-          </w:tcPr>
-          <w:p>
-            <w:pPr>
-              <w:spacing w:before="0" w:after="0"/>
-            </w:pPr>
-            <w:r>
-              <w:rPr>
-                <w:b/>
-                <w:color w:val="075481"/>
-                <w:sz w:val="21"/>
-                <w:szCs w:val="21"/>
-              </w:rPr>
-              <w:t xml:space="preserve">T118</w:t>
-            </w:r>
-          </w:p>
-        </w:tc>
-        <w:tc>
-          <w:tcPr>
-            <w:tcW w:w="4300" w:type="dxa"/>
-          </w:tcPr>
-          <w:p>
-            <w:pPr>
-              <w:spacing w:before="0" w:after="0"/>
-            </w:pPr>
-            <w:r>
-              <w:rPr>
-                <w:sz w:val="21"/>
-                <w:szCs w:val="21"/>
-              </w:rPr>
-              <w:t xml:space="preserve">Ownership</w:t>
-            </w:r>
-          </w:p>
-        </w:tc>
-        <w:tc>
-          <w:tcPr>
-            <w:tcW w:w="3580" w:type="dxa"/>
-            <w:shd w:val="clear" w:color="auto" w:fill="FFFDF0"/>
-          </w:tcPr>
-          <w:p>
-            <w:pPr>
-              <w:spacing w:before="0" w:after="0"/>
-            </w:pPr>
-          </w:p>
-        </w:tc>
-      </w:tr>
-      <w:tr>
-        <w:trPr>
-          <w:trHeight w:val="340" w:hRule="atLeast"/>
-        </w:trPr>
-        <w:tc>
-          <w:tcPr>
-            <w:tcW w:w="2200" w:type="dxa"/>
-          </w:tcPr>
-          <w:p>
-            <w:pPr>
-              <w:spacing w:before="0" w:after="0"/>
-            </w:pPr>
-            <w:r>
-              <w:rPr>
-                <w:b/>
-                <w:color w:val="075481"/>
-                <w:sz w:val="21"/>
-                <w:szCs w:val="21"/>
-              </w:rPr>
-              <w:t xml:space="preserve">T119</w:t>
-            </w:r>
-          </w:p>
-        </w:tc>
-        <w:tc>
-          <w:tcPr>
-            <w:tcW w:w="4300" w:type="dxa"/>
-          </w:tcPr>
-          <w:p>
-            <w:pPr>
-              <w:spacing w:before="0" w:after="0"/>
-            </w:pPr>
-            <w:r>
-              <w:rPr>
-                <w:sz w:val="21"/>
-                <w:szCs w:val="21"/>
-              </w:rPr>
-              <w:t xml:space="preserve">Project Notes</w:t>
-            </w:r>
-          </w:p>
-        </w:tc>
-        <w:tc>
-          <w:tcPr>
-            <w:tcW w:w="3580" w:type="dxa"/>
-            <w:shd w:val="clear" w:color="auto" w:fill="FFFDF0"/>
-          </w:tcPr>
-          <w:p>
-            <w:pPr>
-              <w:spacing w:before="0" w:after="0"/>
-            </w:pPr>
-          </w:p>
-        </w:tc>
-      </w:tr>
-      <w:tr>
-        <w:trPr>
-          <w:trHeight w:val="340" w:hRule="atLeast"/>
-        </w:trPr>
-        <w:tc>
-          <w:tcPr>
-            <w:tcW w:w="2200" w:type="dxa"/>
-          </w:tcPr>
-          <w:p>
-            <w:pPr>
-              <w:spacing w:before="0" w:after="0"/>
-            </w:pPr>
-            <w:r>
-              <w:rPr>
-                <w:b/>
-                <w:color w:val="075481"/>
-                <w:sz w:val="21"/>
-                <w:szCs w:val="21"/>
-              </w:rPr>
-              <w:t xml:space="preserve">T120</w:t>
-            </w:r>
-          </w:p>
-        </w:tc>
-        <w:tc>
-          <w:tcPr>
-            <w:tcW w:w="4300" w:type="dxa"/>
-          </w:tcPr>
-          <w:p>
-            <w:pPr>
-              <w:spacing w:before="0" w:after="0"/>
-            </w:pPr>
-            <w:r>
-              <w:rPr>
-                <w:sz w:val="21"/>
-                <w:szCs w:val="21"/>
-              </w:rPr>
-              <w:t xml:space="preserve">LT Info</w:t>
+              <w:t xml:space="preserve">The panel that appears when you click a parcel.</w:t>
+            </w:r>
+          </w:p>
+        </w:tc>
+      </w:tr>
+      <w:tr>
+        <w:trPr>
+          <w:trHeight w:val="340" w:hRule="atLeast"/>
+        </w:trPr>
+        <w:tc>
+          <w:tcPr>
+            <w:tcW w:w="2200" w:type="dxa"/>
+          </w:tcPr>
+          <w:p>
+            <w:pPr>
+              <w:spacing w:before="0" w:after="0"/>
+            </w:pPr>
+            <w:r>
+              <w:rPr>
+                <w:b/>
+                <w:color w:val="075481"/>
+                <w:sz w:val="21"/>
+                <w:szCs w:val="21"/>
+              </w:rPr>
+              <w:t xml:space="preserve">T121</w:t>
+            </w:r>
+          </w:p>
+          <w:p>
+            <w:pPr>
+              <w:spacing w:before="0" w:after="0"/>
+            </w:pPr>
+            <w:r>
+              <w:rPr>
+                <w:color w:val="595959"/>
+                <w:sz w:val="17"/>
+                <w:szCs w:val="17"/>
+              </w:rPr>
+              <w:t xml:space="preserve">Column headings inside the pop-up</w:t>
+            </w:r>
+          </w:p>
+        </w:tc>
+        <w:tc>
+          <w:tcPr>
+            <w:tcW w:w="4300" w:type="dxa"/>
+          </w:tcPr>
+          <w:p>
+            <w:pPr>
+              <w:spacing w:before="0" w:after="0"/>
+            </w:pPr>
+            <w:r>
+              <w:rPr>
+                <w:sz w:val="21"/>
+                <w:szCs w:val="21"/>
+              </w:rPr>
+              <w:t xml:space="preserve">Type · Units · Timing · Built · Affordable &amp; workforce</w:t>
+            </w:r>
+          </w:p>
+        </w:tc>
+        <w:tc>
+          <w:tcPr>
+            <w:tcW w:w="3580" w:type="dxa"/>
+            <w:shd w:val="clear" w:color="auto" w:fill="FFFDF0"/>
+          </w:tcPr>
+          <w:p>
+            <w:pPr>
+              <w:spacing w:before="0" w:after="0"/>
+            </w:pPr>
+          </w:p>
+        </w:tc>
+      </w:tr>
+      <w:tr>
+        <w:trPr>
+          <w:trHeight w:val="340" w:hRule="atLeast"/>
+        </w:trPr>
+        <w:tc>
+          <w:tcPr>
+            <w:tcW w:w="2200" w:type="dxa"/>
+          </w:tcPr>
+          <w:p>
+            <w:pPr>
+              <w:spacing w:before="0" w:after="0"/>
+            </w:pPr>
+            <w:r>
+              <w:rPr>
+                <w:b/>
+                <w:color w:val="075481"/>
+                <w:sz w:val="21"/>
+                <w:szCs w:val="21"/>
+              </w:rPr>
+              <w:t xml:space="preserve">T122</w:t>
+            </w:r>
+          </w:p>
+          <w:p>
+            <w:pPr>
+              <w:spacing w:before="0" w:after="0"/>
+            </w:pPr>
+            <w:r>
+              <w:rPr>
+                <w:color w:val="595959"/>
+                <w:sz w:val="17"/>
+                <w:szCs w:val="17"/>
+              </w:rPr>
+              <w:t xml:space="preserve">Link at the bottom of the pop-up</w:t>
+            </w:r>
+          </w:p>
+        </w:tc>
+        <w:tc>
+          <w:tcPr>
+            <w:tcW w:w="4300" w:type="dxa"/>
+          </w:tcPr>
+          <w:p>
+            <w:pPr>
+              <w:spacing w:before="0" w:after="0"/>
+            </w:pPr>
+            <w:r>
+              <w:rPr>
+                <w:sz w:val="21"/>
+                <w:szCs w:val="21"/>
+              </w:rPr>
+              <w:t xml:space="preserve">Open in Lake Tahoe Info</w:t>
             </w:r>
           </w:p>
         </w:tc>
@@ -8884,7 +7760,7 @@
           <w:sz w:val="26"/>
           <w:szCs w:val="26"/>
         </w:rPr>
-        <w:t xml:space="preserve">10. Map pop-up</w:t>
+        <w:t xml:space="preserve">10. Footer</w:t>
       </w:r>
     </w:p>
     <w:tbl>
@@ -8977,48 +7853,77 @@
         </w:tc>
       </w:tr>
       <w:tr>
-        <w:tc>
-          <w:tcPr>
-            <w:tcW w:w="10080" w:type="dxa"/>
-            <w:gridSpan w:val="3"/>
-            <w:shd w:val="clear" w:color="auto" w:fill="EDF4FA"/>
-          </w:tcPr>
-          <w:p>
-            <w:pPr>
-              <w:spacing w:before="0" w:after="0"/>
-            </w:pPr>
-            <w:r>
-              <w:rPr>
-                <w:i/>
-                <w:color w:val="595959"/>
-                <w:sz w:val="19"/>
-                <w:szCs w:val="19"/>
-              </w:rPr>
-              <w:t xml:space="preserve">The panel that appears when you click a parcel.</w:t>
-            </w:r>
-          </w:p>
-        </w:tc>
-      </w:tr>
-      <w:tr>
-        <w:trPr>
-          <w:trHeight w:val="340" w:hRule="atLeast"/>
-        </w:trPr>
-        <w:tc>
-          <w:tcPr>
-            <w:tcW w:w="2200" w:type="dxa"/>
-          </w:tcPr>
-          <w:p>
-            <w:pPr>
-              <w:spacing w:before="0" w:after="0"/>
-            </w:pPr>
-            <w:r>
-              <w:rPr>
-                <w:b/>
-                <w:color w:val="075481"/>
-                <w:sz w:val="21"/>
-                <w:szCs w:val="21"/>
-              </w:rPr>
-              <w:t xml:space="preserve">T121</w:t>
+        <w:trPr>
+          <w:trHeight w:val="340" w:hRule="atLeast"/>
+        </w:trPr>
+        <w:tc>
+          <w:tcPr>
+            <w:tcW w:w="2200" w:type="dxa"/>
+          </w:tcPr>
+          <w:p>
+            <w:pPr>
+              <w:spacing w:before="0" w:after="0"/>
+            </w:pPr>
+            <w:r>
+              <w:rPr>
+                <w:b/>
+                <w:color w:val="075481"/>
+                <w:sz w:val="21"/>
+                <w:szCs w:val="21"/>
+              </w:rPr>
+              <w:t xml:space="preserve">T123</w:t>
+            </w:r>
+          </w:p>
+        </w:tc>
+        <w:tc>
+          <w:tcPr>
+            <w:tcW w:w="4300" w:type="dxa"/>
+          </w:tcPr>
+          <w:p>
+            <w:pPr>
+              <w:spacing w:before="0" w:after="0"/>
+            </w:pPr>
+            <w:r>
+              <w:rPr>
+                <w:sz w:val="21"/>
+                <w:szCs w:val="21"/>
+              </w:rPr>
+              <w:t xml:space="preserve">A project of the Tahoe Regional Planning Agency</w:t>
+            </w:r>
+          </w:p>
+        </w:tc>
+        <w:tc>
+          <w:tcPr>
+            <w:tcW w:w="3580" w:type="dxa"/>
+            <w:shd w:val="clear" w:color="auto" w:fill="FFFDF0"/>
+          </w:tcPr>
+          <w:p>
+            <w:pPr>
+              <w:spacing w:before="0" w:after="0"/>
+            </w:pPr>
+          </w:p>
+        </w:tc>
+      </w:tr>
+      <w:tr>
+        <w:trPr>
+          <w:trHeight w:val="340" w:hRule="atLeast"/>
+        </w:trPr>
+        <w:tc>
+          <w:tcPr>
+            <w:tcW w:w="2200" w:type="dxa"/>
+          </w:tcPr>
+          <w:p>
+            <w:pPr>
+              <w:spacing w:before="0" w:after="0"/>
+            </w:pPr>
+            <w:r>
+              <w:rPr>
+                <w:b/>
+                <w:color w:val="075481"/>
+                <w:sz w:val="21"/>
+                <w:szCs w:val="21"/>
+              </w:rPr>
+              <w:t xml:space="preserve">T124</w:t>
             </w:r>
           </w:p>
           <w:p>
@@ -9031,89 +7936,24 @@
                 <w:sz w:val="17"/>
                 <w:szCs w:val="17"/>
               </w:rPr>
-              <w:t xml:space="preserve">Column headings inside the pop-up</w:t>
-            </w:r>
-          </w:p>
-        </w:tc>
-        <w:tc>
-          <w:tcPr>
-            <w:tcW w:w="4300" w:type="dxa"/>
-          </w:tcPr>
-          <w:p>
-            <w:pPr>
-              <w:spacing w:before="0" w:after="0"/>
-            </w:pPr>
-            <w:r>
-              <w:rPr>
-                <w:sz w:val="21"/>
-                <w:szCs w:val="21"/>
-              </w:rPr>
-              <w:t xml:space="preserve">Type · Units · Timing · Built · Affordable &amp; workforce</w:t>
-            </w:r>
-          </w:p>
-        </w:tc>
-        <w:tc>
-          <w:tcPr>
-            <w:tcW w:w="3580" w:type="dxa"/>
-            <w:shd w:val="clear" w:color="auto" w:fill="FFFDF0"/>
-          </w:tcPr>
-          <w:p>
-            <w:pPr>
-              <w:spacing w:before="0" w:after="0"/>
-            </w:pPr>
-          </w:p>
-        </w:tc>
-      </w:tr>
-      <w:tr>
-        <w:trPr>
-          <w:trHeight w:val="340" w:hRule="atLeast"/>
-        </w:trPr>
-        <w:tc>
-          <w:tcPr>
-            <w:tcW w:w="2200" w:type="dxa"/>
-          </w:tcPr>
-          <w:p>
-            <w:pPr>
-              <w:spacing w:before="0" w:after="0"/>
-            </w:pPr>
-            <w:r>
-              <w:rPr>
-                <w:b/>
-                <w:color w:val="075481"/>
-                <w:sz w:val="21"/>
-                <w:szCs w:val="21"/>
-              </w:rPr>
-              <w:t xml:space="preserve">T122</w:t>
-            </w:r>
-          </w:p>
-          <w:p>
-            <w:pPr>
-              <w:spacing w:before="0" w:after="0"/>
-            </w:pPr>
-            <w:r>
-              <w:rPr>
-                <w:color w:val="595959"/>
-                <w:sz w:val="17"/>
-                <w:szCs w:val="17"/>
-              </w:rPr>
-              <w:t xml:space="preserve">Link at the bottom of the pop-up</w:t>
-            </w:r>
-          </w:p>
-        </w:tc>
-        <w:tc>
-          <w:tcPr>
-            <w:tcW w:w="4300" w:type="dxa"/>
-          </w:tcPr>
-          <w:p>
-            <w:pPr>
-              <w:spacing w:before="0" w:after="0"/>
-            </w:pPr>
-            <w:r>
-              <w:rPr>
-                <w:sz w:val="21"/>
-                <w:szCs w:val="21"/>
-              </w:rPr>
-              <w:t xml:space="preserve">Open in Lake Tahoe Info</w:t>
+              <w:t xml:space="preserve">Data credit line</w:t>
+            </w:r>
+          </w:p>
+        </w:tc>
+        <w:tc>
+          <w:tcPr>
+            <w:tcW w:w="4300" w:type="dxa"/>
+          </w:tcPr>
+          <w:p>
+            <w:pPr>
+              <w:spacing w:before="0" w:after="0"/>
+            </w:pPr>
+            <w:r>
+              <w:rPr>
+                <w:sz w:val="21"/>
+                <w:szCs w:val="21"/>
+              </w:rPr>
+              <w:t xml:space="preserve">Housing records: TRPA Long Range Planning · Parcels and VHR: maps.trpa.org</w:t>
             </w:r>
           </w:p>
         </w:tc>
@@ -9146,233 +7986,7 @@
           <w:sz w:val="26"/>
           <w:szCs w:val="26"/>
         </w:rPr>
-        <w:t xml:space="preserve">11. Footer</w:t>
-      </w:r>
-    </w:p>
-    <w:tbl>
-      <w:tblPr>
-        <w:tblW w:w="10080" w:type="dxa"/>
-        <w:tblBorders>
-          <w:top w:val="single" w:sz="4" w:space="0" w:color="D9D9D9"/>
-          <w:left w:val="single" w:sz="4" w:space="0" w:color="D9D9D9"/>
-          <w:bottom w:val="single" w:sz="4" w:space="0" w:color="D9D9D9"/>
-          <w:right w:val="single" w:sz="4" w:space="0" w:color="D9D9D9"/>
-          <w:insideH w:val="single" w:sz="4" w:space="0" w:color="D9D9D9"/>
-          <w:insideV w:val="single" w:sz="4" w:space="0" w:color="D9D9D9"/>
-        </w:tblBorders>
-        <w:tblLayout w:type="fixed"/>
-        <w:tblCellMar>
-          <w:top w:w="80" w:type="dxa"/>
-          <w:left w:w="110" w:type="dxa"/>
-          <w:bottom w:w="80" w:type="dxa"/>
-          <w:right w:w="110" w:type="dxa"/>
-        </w:tblCellMar>
-      </w:tblPr>
-      <w:tblGrid>
-        <w:gridCol w:w="2200"/>
-        <w:gridCol w:w="4300"/>
-        <w:gridCol w:w="3580"/>
-      </w:tblGrid>
-      <w:tr>
-        <w:trPr>
-          <w:tblHeader/>
-        </w:trPr>
-        <w:tc>
-          <w:tcPr>
-            <w:tcW w:w="2200" w:type="dxa"/>
-            <w:shd w:val="clear" w:color="auto" w:fill="0A7EC2"/>
-          </w:tcPr>
-          <w:p>
-            <w:pPr>
-              <w:spacing w:before="0" w:after="0"/>
-            </w:pPr>
-            <w:r>
-              <w:rPr>
-                <w:b/>
-                <w:color w:val="FFFFFF"/>
-                <w:sz w:val="19"/>
-                <w:szCs w:val="19"/>
-              </w:rPr>
-              <w:t xml:space="preserve">Where it appears</w:t>
-            </w:r>
-          </w:p>
-        </w:tc>
-        <w:tc>
-          <w:tcPr>
-            <w:tcW w:w="4300" w:type="dxa"/>
-            <w:shd w:val="clear" w:color="auto" w:fill="0A7EC2"/>
-          </w:tcPr>
-          <w:p>
-            <w:pPr>
-              <w:spacing w:before="0" w:after="0"/>
-            </w:pPr>
-            <w:r>
-              <w:rPr>
-                <w:b/>
-                <w:color w:val="FFFFFF"/>
-                <w:sz w:val="19"/>
-                <w:szCs w:val="19"/>
-              </w:rPr>
-              <w:t xml:space="preserve">Current wording</w:t>
-            </w:r>
-          </w:p>
-        </w:tc>
-        <w:tc>
-          <w:tcPr>
-            <w:tcW w:w="3580" w:type="dxa"/>
-            <w:shd w:val="clear" w:color="auto" w:fill="0A7EC2"/>
-          </w:tcPr>
-          <w:p>
-            <w:pPr>
-              <w:spacing w:before="0" w:after="0"/>
-            </w:pPr>
-            <w:r>
-              <w:rPr>
-                <w:b/>
-                <w:color w:val="FFFFFF"/>
-                <w:sz w:val="19"/>
-                <w:szCs w:val="19"/>
-              </w:rPr>
-              <w:t xml:space="preserve">Your new wording</w:t>
-            </w:r>
-          </w:p>
-        </w:tc>
-      </w:tr>
-      <w:tr>
-        <w:trPr>
-          <w:trHeight w:val="340" w:hRule="atLeast"/>
-        </w:trPr>
-        <w:tc>
-          <w:tcPr>
-            <w:tcW w:w="2200" w:type="dxa"/>
-          </w:tcPr>
-          <w:p>
-            <w:pPr>
-              <w:spacing w:before="0" w:after="0"/>
-            </w:pPr>
-            <w:r>
-              <w:rPr>
-                <w:b/>
-                <w:color w:val="075481"/>
-                <w:sz w:val="21"/>
-                <w:szCs w:val="21"/>
-              </w:rPr>
-              <w:t xml:space="preserve">T123</w:t>
-            </w:r>
-          </w:p>
-        </w:tc>
-        <w:tc>
-          <w:tcPr>
-            <w:tcW w:w="4300" w:type="dxa"/>
-          </w:tcPr>
-          <w:p>
-            <w:pPr>
-              <w:spacing w:before="0" w:after="0"/>
-            </w:pPr>
-            <w:r>
-              <w:rPr>
-                <w:sz w:val="21"/>
-                <w:szCs w:val="21"/>
-              </w:rPr>
-              <w:t xml:space="preserve">A project of the Tahoe Regional Planning Agency</w:t>
-            </w:r>
-          </w:p>
-        </w:tc>
-        <w:tc>
-          <w:tcPr>
-            <w:tcW w:w="3580" w:type="dxa"/>
-            <w:shd w:val="clear" w:color="auto" w:fill="FFFDF0"/>
-          </w:tcPr>
-          <w:p>
-            <w:pPr>
-              <w:spacing w:before="0" w:after="0"/>
-            </w:pPr>
-          </w:p>
-        </w:tc>
-      </w:tr>
-      <w:tr>
-        <w:trPr>
-          <w:trHeight w:val="340" w:hRule="atLeast"/>
-        </w:trPr>
-        <w:tc>
-          <w:tcPr>
-            <w:tcW w:w="2200" w:type="dxa"/>
-          </w:tcPr>
-          <w:p>
-            <w:pPr>
-              <w:spacing w:before="0" w:after="0"/>
-            </w:pPr>
-            <w:r>
-              <w:rPr>
-                <w:b/>
-                <w:color w:val="075481"/>
-                <w:sz w:val="21"/>
-                <w:szCs w:val="21"/>
-              </w:rPr>
-              <w:t xml:space="preserve">T124</w:t>
-            </w:r>
-          </w:p>
-          <w:p>
-            <w:pPr>
-              <w:spacing w:before="0" w:after="0"/>
-            </w:pPr>
-            <w:r>
-              <w:rPr>
-                <w:color w:val="595959"/>
-                <w:sz w:val="17"/>
-                <w:szCs w:val="17"/>
-              </w:rPr>
-              <w:t xml:space="preserve">Data credit line</w:t>
-            </w:r>
-          </w:p>
-        </w:tc>
-        <w:tc>
-          <w:tcPr>
-            <w:tcW w:w="4300" w:type="dxa"/>
-          </w:tcPr>
-          <w:p>
-            <w:pPr>
-              <w:spacing w:before="0" w:after="0"/>
-            </w:pPr>
-            <w:r>
-              <w:rPr>
-                <w:sz w:val="21"/>
-                <w:szCs w:val="21"/>
-              </w:rPr>
-              <w:t xml:space="preserve">Housing records: TRPA Long Range Planning · Parcels and VHR: maps.trpa.org</w:t>
-            </w:r>
-          </w:p>
-        </w:tc>
-        <w:tc>
-          <w:tcPr>
-            <w:tcW w:w="3580" w:type="dxa"/>
-            <w:shd w:val="clear" w:color="auto" w:fill="FFFDF0"/>
-          </w:tcPr>
-          <w:p>
-            <w:pPr>
-              <w:spacing w:before="0" w:after="0"/>
-            </w:pPr>
-          </w:p>
-        </w:tc>
-      </w:tr>
-    </w:tbl>
-    <w:p>
-      <w:pPr>
-        <w:spacing w:before="0" w:after="200"/>
-      </w:pPr>
-    </w:p>
-    <w:p>
-      <w:pPr>
-        <w:spacing w:before="260" w:after="130"/>
-      </w:pPr>
-      <w:r>
-        <w:rPr>
-          <w:b/>
-          <w:color w:val="075481"/>
-          <w:sz w:val="26"/>
-          <w:szCs w:val="26"/>
-        </w:rPr>
-        <w:t xml:space="preserve">12. Loading and error messages</w:t>
+        <w:t xml:space="preserve">11. Loading and error messages</w:t>
       </w:r>
     </w:p>
     <w:tbl>

</xml_diff>